<commit_message>
add: new sections on report
</commit_message>
<xml_diff>
--- a/report/TF_Informe_Almeida.docx
+++ b/report/TF_Informe_Almeida.docx
@@ -13,12 +13,12 @@
           <wp:inline distB="114300" distT="114300" distL="114300" distR="114300">
             <wp:extent cx="914400" cy="934192"/>
             <wp:effectExtent b="0" l="0" r="0" t="0"/>
-            <wp:docPr descr="GameLab: Conceptualización y narrativa visual" id="4" name="image2.png"/>
+            <wp:docPr descr="GameLab: Conceptualización y narrativa visual" id="7" name="image6.png"/>
             <a:graphic>
               <a:graphicData uri="http://schemas.openxmlformats.org/drawingml/2006/picture">
                 <pic:pic>
                   <pic:nvPicPr>
-                    <pic:cNvPr descr="GameLab: Conceptualización y narrativa visual" id="0" name="image2.png"/>
+                    <pic:cNvPr descr="GameLab: Conceptualización y narrativa visual" id="0" name="image6.png"/>
                     <pic:cNvPicPr preferRelativeResize="0"/>
                   </pic:nvPicPr>
                   <pic:blipFill>
@@ -335,7 +335,7 @@
     </w:p>
     <w:sdt>
       <w:sdtPr>
-        <w:id w:val="1956199100"/>
+        <w:id w:val="600494271"/>
         <w:docPartObj>
           <w:docPartGallery w:val="Table of Contents"/>
           <w:docPartUnique w:val="1"/>
@@ -667,6 +667,158 @@
               <w:tab w:val="right" w:leader="none" w:pos="12000"/>
             </w:tabs>
             <w:spacing w:after="0" w:before="60" w:line="240" w:lineRule="auto"/>
+            <w:ind w:left="360" w:firstLine="0"/>
+            <w:rPr>
+              <w:rFonts w:ascii="Arial" w:cs="Arial" w:eastAsia="Arial" w:hAnsi="Arial"/>
+              <w:b w:val="0"/>
+              <w:bCs w:val="0"/>
+              <w:i w:val="0"/>
+              <w:iCs w:val="0"/>
+              <w:smallCaps w:val="0"/>
+              <w:strike w:val="0"/>
+              <w:color w:val="000000"/>
+              <w:sz w:val="22"/>
+              <w:szCs w:val="22"/>
+              <w:u w:val="none"/>
+              <w:shd w:fill="auto" w:val="clear"/>
+              <w:vertAlign w:val="baseline"/>
+            </w:rPr>
+          </w:pPr>
+          <w:hyperlink w:anchor="_r6etvpsxyux4">
+            <w:r>
+              <w:rPr>
+                <w:rFonts w:ascii="Times New Roman" w:cs="Times New Roman" w:eastAsia="Times New Roman" w:hAnsi="Times New Roman"/>
+                <w:b w:val="0"/>
+                <w:bCs w:val="0"/>
+                <w:i w:val="0"/>
+                <w:iCs w:val="0"/>
+                <w:smallCaps w:val="0"/>
+                <w:strike w:val="0"/>
+                <w:color w:val="000000"/>
+                <w:sz w:val="24"/>
+                <w:szCs w:val="24"/>
+                <w:u w:val="none"/>
+                <w:shd w:fill="auto" w:val="clear"/>
+                <w:vertAlign w:val="baseline"/>
+                <w:rtl w:val="0"/>
+              </w:rPr>
+              <w:t xml:space="preserve">5.1 Clasificación binaria y matriz de confusión</w:t>
+              <w:tab/>
+              <w:t xml:space="preserve">12</w:t>
+            </w:r>
+          </w:hyperlink>
+          <w:r>
+            <w:rPr>
+              <w:rtl w:val="0"/>
+            </w:rPr>
+          </w:r>
+        </w:p>
+        <w:p>
+          <w:pPr>
+            <w:widowControl w:val="0"/>
+            <w:tabs>
+              <w:tab w:val="right" w:leader="none" w:pos="12000"/>
+            </w:tabs>
+            <w:spacing w:after="0" w:before="60" w:line="240" w:lineRule="auto"/>
+            <w:ind w:left="360" w:firstLine="0"/>
+            <w:rPr>
+              <w:rFonts w:ascii="Arial" w:cs="Arial" w:eastAsia="Arial" w:hAnsi="Arial"/>
+              <w:b w:val="0"/>
+              <w:bCs w:val="0"/>
+              <w:i w:val="0"/>
+              <w:iCs w:val="0"/>
+              <w:smallCaps w:val="0"/>
+              <w:strike w:val="0"/>
+              <w:color w:val="000000"/>
+              <w:sz w:val="22"/>
+              <w:szCs w:val="22"/>
+              <w:u w:val="none"/>
+              <w:shd w:fill="auto" w:val="clear"/>
+              <w:vertAlign w:val="baseline"/>
+            </w:rPr>
+          </w:pPr>
+          <w:hyperlink w:anchor="_jfscg4ieemho">
+            <w:r>
+              <w:rPr>
+                <w:rFonts w:ascii="Times New Roman" w:cs="Times New Roman" w:eastAsia="Times New Roman" w:hAnsi="Times New Roman"/>
+                <w:b w:val="0"/>
+                <w:bCs w:val="0"/>
+                <w:i w:val="0"/>
+                <w:iCs w:val="0"/>
+                <w:smallCaps w:val="0"/>
+                <w:strike w:val="0"/>
+                <w:color w:val="000000"/>
+                <w:sz w:val="24"/>
+                <w:szCs w:val="24"/>
+                <w:u w:val="none"/>
+                <w:shd w:fill="auto" w:val="clear"/>
+                <w:vertAlign w:val="baseline"/>
+                <w:rtl w:val="0"/>
+              </w:rPr>
+              <w:t xml:space="preserve">5.2 Comparación con un modelo de Regresión Lineal</w:t>
+              <w:tab/>
+              <w:t xml:space="preserve">14</w:t>
+            </w:r>
+          </w:hyperlink>
+          <w:r>
+            <w:rPr>
+              <w:rtl w:val="0"/>
+            </w:rPr>
+          </w:r>
+        </w:p>
+        <w:p>
+          <w:pPr>
+            <w:widowControl w:val="0"/>
+            <w:tabs>
+              <w:tab w:val="right" w:leader="none" w:pos="12000"/>
+            </w:tabs>
+            <w:spacing w:after="0" w:before="60" w:line="240" w:lineRule="auto"/>
+            <w:rPr>
+              <w:b w:val="1"/>
+              <w:bCs w:val="1"/>
+              <w:i w:val="0"/>
+              <w:iCs w:val="0"/>
+              <w:smallCaps w:val="0"/>
+              <w:strike w:val="0"/>
+              <w:color w:val="000000"/>
+              <w:u w:val="none"/>
+              <w:shd w:fill="auto" w:val="clear"/>
+              <w:vertAlign w:val="baseline"/>
+            </w:rPr>
+          </w:pPr>
+          <w:hyperlink w:anchor="_b1h62fb73dp">
+            <w:r>
+              <w:rPr>
+                <w:b w:val="1"/>
+                <w:bCs w:val="1"/>
+                <w:i w:val="0"/>
+                <w:iCs w:val="0"/>
+                <w:smallCaps w:val="0"/>
+                <w:strike w:val="0"/>
+                <w:color w:val="000000"/>
+                <w:u w:val="none"/>
+                <w:shd w:fill="auto" w:val="clear"/>
+                <w:vertAlign w:val="baseline"/>
+                <w:rtl w:val="0"/>
+              </w:rPr>
+              <w:t xml:space="preserve">6. Consideraciones éticas</w:t>
+              <w:tab/>
+              <w:t xml:space="preserve">16</w:t>
+            </w:r>
+          </w:hyperlink>
+          <w:r>
+            <w:rPr>
+              <w:rtl w:val="0"/>
+            </w:rPr>
+          </w:r>
+        </w:p>
+        <w:p>
+          <w:pPr>
+            <w:widowControl w:val="0"/>
+            <w:tabs>
+              <w:tab w:val="right" w:leader="none" w:pos="12000"/>
+            </w:tabs>
+            <w:spacing w:after="0" w:before="60" w:line="240" w:lineRule="auto"/>
             <w:rPr>
               <w:rFonts w:ascii="Arial" w:cs="Arial" w:eastAsia="Arial" w:hAnsi="Arial"/>
               <w:b w:val="1"/>
@@ -701,9 +853,9 @@
                 <w:vertAlign w:val="baseline"/>
                 <w:rtl w:val="0"/>
               </w:rPr>
-              <w:t xml:space="preserve">6. Conclusiones</w:t>
+              <w:t xml:space="preserve">7. Conclusiones</w:t>
               <w:tab/>
-              <w:t xml:space="preserve">12</w:t>
+              <w:t xml:space="preserve">17</w:t>
             </w:r>
           </w:hyperlink>
           <w:r>
@@ -753,9 +905,9 @@
                 <w:vertAlign w:val="baseline"/>
                 <w:rtl w:val="0"/>
               </w:rPr>
-              <w:t xml:space="preserve">7. Referencias bibliográficas</w:t>
+              <w:t xml:space="preserve">8. Referencias bibliográficas</w:t>
               <w:tab/>
-              <w:t xml:space="preserve">13</w:t>
+              <w:t xml:space="preserve">19</w:t>
             </w:r>
           </w:hyperlink>
           <w:r>
@@ -805,9 +957,9 @@
                 <w:vertAlign w:val="baseline"/>
                 <w:rtl w:val="0"/>
               </w:rPr>
-              <w:t xml:space="preserve">8. Anexos</w:t>
+              <w:t xml:space="preserve">9. Anexos</w:t>
               <w:tab/>
-              <w:t xml:space="preserve">15</w:t>
+              <w:t xml:space="preserve">21</w:t>
             </w:r>
           </w:hyperlink>
           <w:r>
@@ -860,7 +1012,7 @@
               </w:rPr>
               <w:t xml:space="preserve">Anexo A: Repositorio del proyecto</w:t>
               <w:tab/>
-              <w:t xml:space="preserve">15</w:t>
+              <w:t xml:space="preserve">21</w:t>
             </w:r>
           </w:hyperlink>
           <w:r>
@@ -1082,7 +1234,7 @@
       <w:pPr>
         <w:numPr>
           <w:ilvl w:val="0"/>
-          <w:numId w:val="2"/>
+          <w:numId w:val="3"/>
         </w:numPr>
         <w:spacing w:after="0" w:afterAutospacing="0"/>
         <w:ind w:left="720" w:hanging="360"/>
@@ -1109,7 +1261,7 @@
       <w:pPr>
         <w:numPr>
           <w:ilvl w:val="0"/>
-          <w:numId w:val="2"/>
+          <w:numId w:val="3"/>
         </w:numPr>
         <w:spacing w:after="0" w:afterAutospacing="0" w:before="0" w:beforeAutospacing="0"/>
         <w:ind w:left="720" w:hanging="360"/>
@@ -1136,7 +1288,7 @@
       <w:pPr>
         <w:numPr>
           <w:ilvl w:val="0"/>
-          <w:numId w:val="2"/>
+          <w:numId w:val="3"/>
         </w:numPr>
         <w:spacing w:before="0" w:beforeAutospacing="0"/>
         <w:ind w:left="720" w:hanging="360"/>
@@ -1428,12 +1580,12 @@
           <wp:inline distB="114300" distT="114300" distL="114300" distR="114300">
             <wp:extent cx="4572000" cy="4160520"/>
             <wp:effectExtent b="0" l="0" r="0" t="0"/>
-            <wp:docPr id="3" name="image5.png"/>
+            <wp:docPr id="3" name="image8.png"/>
             <a:graphic>
               <a:graphicData uri="http://schemas.openxmlformats.org/drawingml/2006/picture">
                 <pic:pic>
                   <pic:nvPicPr>
-                    <pic:cNvPr id="0" name="image5.png"/>
+                    <pic:cNvPr id="0" name="image8.png"/>
                     <pic:cNvPicPr preferRelativeResize="0"/>
                   </pic:nvPicPr>
                   <pic:blipFill>
@@ -1928,12 +2080,12 @@
           <wp:inline distB="114300" distT="114300" distL="114300" distR="114300">
             <wp:extent cx="4572000" cy="3650566"/>
             <wp:effectExtent b="0" l="0" r="0" t="0"/>
-            <wp:docPr id="1" name="image4.png"/>
+            <wp:docPr id="1" name="image3.png"/>
             <a:graphic>
               <a:graphicData uri="http://schemas.openxmlformats.org/drawingml/2006/picture">
                 <pic:pic>
                   <pic:nvPicPr>
-                    <pic:cNvPr id="0" name="image4.png"/>
+                    <pic:cNvPr id="0" name="image3.png"/>
                     <pic:cNvPicPr preferRelativeResize="0"/>
                   </pic:nvPicPr>
                   <pic:blipFill>
@@ -2516,12 +2668,12 @@
           <wp:inline distB="114300" distT="114300" distL="114300" distR="114300">
             <wp:extent cx="5943600" cy="1384300"/>
             <wp:effectExtent b="0" l="0" r="0" t="0"/>
-            <wp:docPr id="5" name="image3.png"/>
+            <wp:docPr id="8" name="image5.png"/>
             <a:graphic>
               <a:graphicData uri="http://schemas.openxmlformats.org/drawingml/2006/picture">
                 <pic:pic>
                   <pic:nvPicPr>
-                    <pic:cNvPr id="0" name="image3.png"/>
+                    <pic:cNvPr id="0" name="image5.png"/>
                     <pic:cNvPicPr preferRelativeResize="0"/>
                   </pic:nvPicPr>
                   <pic:blipFill>
@@ -2621,7 +2773,7 @@
       <w:pPr>
         <w:numPr>
           <w:ilvl w:val="0"/>
-          <w:numId w:val="1"/>
+          <w:numId w:val="2"/>
         </w:numPr>
         <w:spacing w:after="0" w:afterAutospacing="0"/>
         <w:ind w:left="720" w:hanging="360"/>
@@ -2726,6 +2878,1323 @@
           <w:rtl w:val="0"/>
         </w:rPr>
         <w:t xml:space="preserve">). Estas variables constituyen la información mínima necesaria para realizar una estimación confiable del nivel de adicción.</w:t>
+      </w:r>
+    </w:p>
+    <w:p>
+      <w:pPr>
+        <w:numPr>
+          <w:ilvl w:val="0"/>
+          <w:numId w:val="2"/>
+        </w:numPr>
+        <w:spacing w:before="0" w:beforeAutospacing="0"/>
+        <w:ind w:left="720" w:hanging="360"/>
+        <w:rPr>
+          <w:u w:val="none"/>
+        </w:rPr>
+      </w:pPr>
+      <w:r>
+        <w:rPr>
+          <w:b w:val="1"/>
+          <w:bCs w:val="1"/>
+          <w:rtl w:val="0"/>
+        </w:rPr>
+        <w:t xml:space="preserve">Sección avanzada (opcional):</w:t>
+      </w:r>
+      <w:r>
+        <w:rPr>
+          <w:rtl w:val="0"/>
+        </w:rPr>
+        <w:t xml:space="preserve"> incorpora el resto de las variables demográficas y psicosociales consideradas por el modelo, como la edad, el género, el nivel de ansiedad, la autoestima o el control parental. Cuando el usuario desconoce alguno de estos valores, la aplicación emplea valores de referencia obtenidos del conjunto de datos para completar la información requerida sin interrumpir el proceso de predicción.</w:t>
+      </w:r>
+    </w:p>
+    <w:p>
+      <w:pPr>
+        <w:rPr>
+          <w:b w:val="1"/>
+          <w:bCs w:val="1"/>
+        </w:rPr>
+      </w:pPr>
+      <w:r>
+        <w:rPr>
+          <w:rtl w:val="0"/>
+        </w:rPr>
+        <w:t xml:space="preserve">El sistema fue desarrollado en </w:t>
+      </w:r>
+      <w:r>
+        <w:rPr>
+          <w:b w:val="1"/>
+          <w:bCs w:val="1"/>
+          <w:rtl w:val="0"/>
+        </w:rPr>
+        <w:t xml:space="preserve">Python</w:t>
+      </w:r>
+      <w:r>
+        <w:rPr>
+          <w:rtl w:val="0"/>
+        </w:rPr>
+        <w:t xml:space="preserve">, empleando </w:t>
+      </w:r>
+      <w:r>
+        <w:rPr>
+          <w:b w:val="1"/>
+          <w:bCs w:val="1"/>
+          <w:rtl w:val="0"/>
+        </w:rPr>
+        <w:t xml:space="preserve">scikit-learn</w:t>
+      </w:r>
+      <w:r>
+        <w:rPr>
+          <w:rtl w:val="0"/>
+        </w:rPr>
+        <w:t xml:space="preserve"> para la implementación de la Red Neuronal Artificial (</w:t>
+      </w:r>
+      <w:r>
+        <w:rPr>
+          <w:b w:val="1"/>
+          <w:bCs w:val="1"/>
+          <w:rtl w:val="0"/>
+        </w:rPr>
+        <w:t xml:space="preserve">MLPRegressor</w:t>
+      </w:r>
+      <w:r>
+        <w:rPr>
+          <w:rtl w:val="0"/>
+        </w:rPr>
+        <w:t xml:space="preserve">), </w:t>
+      </w:r>
+      <w:r>
+        <w:rPr>
+          <w:b w:val="1"/>
+          <w:bCs w:val="1"/>
+          <w:rtl w:val="0"/>
+        </w:rPr>
+        <w:t xml:space="preserve">pandas</w:t>
+      </w:r>
+      <w:r>
+        <w:rPr>
+          <w:rtl w:val="0"/>
+        </w:rPr>
+        <w:t xml:space="preserve"> para la manipulación del conjunto de datos, </w:t>
+      </w:r>
+      <w:r>
+        <w:rPr>
+          <w:b w:val="1"/>
+          <w:bCs w:val="1"/>
+          <w:rtl w:val="0"/>
+        </w:rPr>
+        <w:t xml:space="preserve">NumPy</w:t>
+      </w:r>
+      <w:r>
+        <w:rPr>
+          <w:rtl w:val="0"/>
+        </w:rPr>
+        <w:t xml:space="preserve"> para las operaciones numéricas y </w:t>
+      </w:r>
+      <w:r>
+        <w:rPr>
+          <w:b w:val="1"/>
+          <w:bCs w:val="1"/>
+          <w:rtl w:val="0"/>
+        </w:rPr>
+        <w:t xml:space="preserve">Gradio</w:t>
+      </w:r>
+      <w:r>
+        <w:rPr>
+          <w:rtl w:val="0"/>
+        </w:rPr>
+        <w:t xml:space="preserve"> para el desarrollo de la interfaz web. La aplicación fue diseñada para ejecutarse en cualquier entorno compatible con </w:t>
+      </w:r>
+      <w:r>
+        <w:rPr>
+          <w:b w:val="1"/>
+          <w:bCs w:val="1"/>
+          <w:rtl w:val="0"/>
+        </w:rPr>
+        <w:t xml:space="preserve">Python 3.14</w:t>
+      </w:r>
+      <w:r>
+        <w:rPr>
+          <w:rtl w:val="0"/>
+        </w:rPr>
+        <w:t xml:space="preserve"> o superior, facilitando su instalación y posterior despliegue.</w:t>
+      </w:r>
+      <w:r>
+        <w:rPr>
+          <w:rtl w:val="0"/>
+        </w:rPr>
+      </w:r>
+    </w:p>
+    <w:p>
+      <w:pPr>
+        <w:pStyle w:val="Heading2"/>
+        <w:rPr/>
+      </w:pPr>
+      <w:bookmarkStart w:colFirst="0" w:colLast="0" w:name="_az5usi8kpkbn" w:id="7"/>
+      <w:bookmarkEnd w:id="7"/>
+      <w:r>
+        <w:rPr>
+          <w:rtl w:val="0"/>
+        </w:rPr>
+        <w:t xml:space="preserve">5. Validación de resultados y pruebas</w:t>
+      </w:r>
+    </w:p>
+    <w:p>
+      <w:pPr>
+        <w:ind w:firstLine="720"/>
+        <w:rPr/>
+      </w:pPr>
+      <w:r>
+        <w:rPr>
+          <w:rtl w:val="0"/>
+        </w:rPr>
+        <w:t xml:space="preserve">El modelo fue evaluado utilizando el </w:t>
+      </w:r>
+      <w:r>
+        <w:rPr>
+          <w:b w:val="1"/>
+          <w:bCs w:val="1"/>
+          <w:rtl w:val="0"/>
+        </w:rPr>
+        <w:t xml:space="preserve">20 %</w:t>
+      </w:r>
+      <w:r>
+        <w:rPr>
+          <w:rtl w:val="0"/>
+        </w:rPr>
+        <w:t xml:space="preserve"> del conjunto de datos reservado para prueba, correspondiente a </w:t>
+      </w:r>
+      <w:r>
+        <w:rPr>
+          <w:b w:val="1"/>
+          <w:bCs w:val="1"/>
+          <w:rtl w:val="0"/>
+        </w:rPr>
+        <w:t xml:space="preserve">600 registros</w:t>
+      </w:r>
+      <w:r>
+        <w:rPr>
+          <w:rtl w:val="0"/>
+        </w:rPr>
+        <w:t xml:space="preserve">. Para medir su desempeño se emplearon dos métricas ampliamente utilizadas en problemas de regresión: el </w:t>
+      </w:r>
+      <w:r>
+        <w:rPr>
+          <w:b w:val="1"/>
+          <w:bCs w:val="1"/>
+          <w:rtl w:val="0"/>
+        </w:rPr>
+        <w:t xml:space="preserve">Coeficiente de Determinación (R²)</w:t>
+      </w:r>
+      <w:r>
+        <w:rPr>
+          <w:rtl w:val="0"/>
+        </w:rPr>
+        <w:t xml:space="preserve"> y el </w:t>
+      </w:r>
+      <w:r>
+        <w:rPr>
+          <w:b w:val="1"/>
+          <w:bCs w:val="1"/>
+          <w:rtl w:val="0"/>
+        </w:rPr>
+        <w:t xml:space="preserve">Error Absoluto Medio (MAE)</w:t>
+      </w:r>
+      <w:r>
+        <w:rPr>
+          <w:rtl w:val="0"/>
+        </w:rPr>
+        <w:t xml:space="preserve">.</w:t>
+      </w:r>
+    </w:p>
+    <w:p>
+      <w:pPr>
+        <w:ind w:firstLine="720"/>
+        <w:rPr/>
+      </w:pPr>
+      <w:r>
+        <w:rPr>
+          <w:rtl w:val="0"/>
+        </w:rPr>
+        <w:t xml:space="preserve">Las métricas obtenidas fueron las siguientes:</w:t>
+      </w:r>
+    </w:p>
+    <w:p>
+      <w:pPr>
+        <w:numPr>
+          <w:ilvl w:val="0"/>
+          <w:numId w:val="4"/>
+        </w:numPr>
+        <w:spacing w:after="0" w:afterAutospacing="0"/>
+        <w:ind w:left="720" w:hanging="360"/>
+        <w:rPr>
+          <w:u w:val="none"/>
+        </w:rPr>
+      </w:pPr>
+      <w:r>
+        <w:rPr>
+          <w:b w:val="1"/>
+          <w:bCs w:val="1"/>
+          <w:rtl w:val="0"/>
+        </w:rPr>
+        <w:t xml:space="preserve">Coeficiente de determinación (R²):</w:t>
+      </w:r>
+      <w:r>
+        <w:rPr>
+          <w:rtl w:val="0"/>
+        </w:rPr>
+        <w:t xml:space="preserve"> </w:t>
+      </w:r>
+      <w:r>
+        <w:rPr>
+          <w:b w:val="1"/>
+          <w:bCs w:val="1"/>
+          <w:rtl w:val="0"/>
+        </w:rPr>
+        <w:t xml:space="preserve">0.987</w:t>
+      </w:r>
+      <w:r>
+        <w:rPr>
+          <w:rtl w:val="0"/>
+        </w:rPr>
+      </w:r>
+    </w:p>
+    <w:p>
+      <w:pPr>
+        <w:numPr>
+          <w:ilvl w:val="0"/>
+          <w:numId w:val="4"/>
+        </w:numPr>
+        <w:spacing w:before="0" w:beforeAutospacing="0"/>
+        <w:ind w:left="720" w:hanging="360"/>
+        <w:rPr>
+          <w:u w:val="none"/>
+        </w:rPr>
+      </w:pPr>
+      <w:r>
+        <w:rPr>
+          <w:b w:val="1"/>
+          <w:bCs w:val="1"/>
+          <w:rtl w:val="0"/>
+        </w:rPr>
+        <w:t xml:space="preserve">Error Absoluto Medio (MAE):</w:t>
+      </w:r>
+      <w:r>
+        <w:rPr>
+          <w:rtl w:val="0"/>
+        </w:rPr>
+        <w:t xml:space="preserve"> </w:t>
+      </w:r>
+      <w:r>
+        <w:rPr>
+          <w:b w:val="1"/>
+          <w:bCs w:val="1"/>
+          <w:rtl w:val="0"/>
+        </w:rPr>
+        <w:t xml:space="preserve">0.146</w:t>
+      </w:r>
+      <w:r>
+        <w:rPr>
+          <w:rtl w:val="0"/>
+        </w:rPr>
+      </w:r>
+    </w:p>
+    <w:p>
+      <w:pPr>
+        <w:ind w:firstLine="720"/>
+        <w:rPr/>
+      </w:pPr>
+      <w:r>
+        <w:rPr>
+          <w:rtl w:val="0"/>
+        </w:rPr>
+        <w:t xml:space="preserve">Estos resultados indican que el modelo explica una proporción muy alta de la variabilidad observada en el nivel de adicción y realiza predicciones con un error promedio inferior a dos décimas de punto en una escala de 0 a 10.</w:t>
+      </w:r>
+    </w:p>
+    <w:p>
+      <w:pPr>
+        <w:ind w:firstLine="720"/>
+        <w:rPr/>
+      </w:pPr>
+      <w:r>
+        <w:rPr>
+          <w:rtl w:val="0"/>
+        </w:rPr>
+        <w:t xml:space="preserve">El elevado valor de </w:t>
+      </w:r>
+      <w:r>
+        <w:rPr>
+          <w:b w:val="1"/>
+          <w:bCs w:val="1"/>
+          <w:rtl w:val="0"/>
+        </w:rPr>
+        <w:t xml:space="preserve">R²</w:t>
+      </w:r>
+      <w:r>
+        <w:rPr>
+          <w:rtl w:val="0"/>
+        </w:rPr>
+        <w:t xml:space="preserve"> puede atribuirse, en parte, a las características del conjunto de datos utilizado. La variable objetivo (</w:t>
+      </w:r>
+      <w:r>
+        <w:rPr>
+          <w:b w:val="1"/>
+          <w:bCs w:val="1"/>
+          <w:rtl w:val="0"/>
+        </w:rPr>
+        <w:t xml:space="preserve">Addiction_Level</w:t>
+      </w:r>
+      <w:r>
+        <w:rPr>
+          <w:rtl w:val="0"/>
+        </w:rPr>
+        <w:t xml:space="preserve">) presenta una fuerte relación con variables como </w:t>
+      </w:r>
+      <w:r>
+        <w:rPr>
+          <w:b w:val="1"/>
+          <w:bCs w:val="1"/>
+          <w:rtl w:val="0"/>
+        </w:rPr>
+        <w:t xml:space="preserve">Daily_Usage_Hours</w:t>
+      </w:r>
+      <w:r>
+        <w:rPr>
+          <w:rtl w:val="0"/>
+        </w:rPr>
+        <w:t xml:space="preserve">, </w:t>
+      </w:r>
+      <w:r>
+        <w:rPr>
+          <w:b w:val="1"/>
+          <w:bCs w:val="1"/>
+          <w:rtl w:val="0"/>
+        </w:rPr>
+        <w:t xml:space="preserve">Time_on_Social_Media</w:t>
+      </w:r>
+      <w:r>
+        <w:rPr>
+          <w:rtl w:val="0"/>
+        </w:rPr>
+        <w:t xml:space="preserve"> y </w:t>
+      </w:r>
+      <w:r>
+        <w:rPr>
+          <w:b w:val="1"/>
+          <w:bCs w:val="1"/>
+          <w:rtl w:val="0"/>
+        </w:rPr>
+        <w:t xml:space="preserve">Apps_Used_Daily</w:t>
+      </w:r>
+      <w:r>
+        <w:rPr>
+          <w:rtl w:val="0"/>
+        </w:rPr>
+        <w:t xml:space="preserve">, las cuales mostraron las correlaciones más altas durante el análisis exploratorio. Asimismo, más del </w:t>
+      </w:r>
+      <w:r>
+        <w:rPr>
+          <w:b w:val="1"/>
+          <w:bCs w:val="1"/>
+          <w:rtl w:val="0"/>
+        </w:rPr>
+        <w:t xml:space="preserve">50 %</w:t>
+      </w:r>
+      <w:r>
+        <w:rPr>
+          <w:rtl w:val="0"/>
+        </w:rPr>
+        <w:t xml:space="preserve"> de los registros corresponde al valor máximo de la variable objetivo, reduciendo la variabilidad de una parte importante del conjunto de datos y contribuyendo al elevado desempeño observado.</w:t>
+      </w:r>
+    </w:p>
+    <w:p>
+      <w:pPr>
+        <w:ind w:firstLine="720"/>
+        <w:rPr/>
+      </w:pPr>
+      <w:r>
+        <w:rPr>
+          <w:rtl w:val="0"/>
+        </w:rPr>
+        <w:t xml:space="preserve">Por otra parte, la separación entre los conjuntos de entrenamiento y prueba, junto con la aplicación de regularización </w:t>
+      </w:r>
+      <w:r>
+        <w:rPr>
+          <w:b w:val="1"/>
+          <w:bCs w:val="1"/>
+          <w:rtl w:val="0"/>
+        </w:rPr>
+        <w:t xml:space="preserve">L2</w:t>
+      </w:r>
+      <w:r>
+        <w:rPr>
+          <w:rtl w:val="0"/>
+        </w:rPr>
+        <w:t xml:space="preserve"> (</w:t>
+      </w:r>
+      <w:r>
+        <w:rPr>
+          <w:i w:val="1"/>
+          <w:iCs w:val="1"/>
+          <w:rtl w:val="0"/>
+        </w:rPr>
+        <w:t xml:space="preserve">alpha</w:t>
+      </w:r>
+      <w:r>
+        <w:rPr>
+          <w:rtl w:val="0"/>
+        </w:rPr>
+        <w:t xml:space="preserve"> = 0.001), contribuye a disminuir el riesgo de sobreajuste y favorece la capacidad de generalización del modelo. El bajo valor obtenido para el </w:t>
+      </w:r>
+      <w:r>
+        <w:rPr>
+          <w:b w:val="1"/>
+          <w:bCs w:val="1"/>
+          <w:rtl w:val="0"/>
+        </w:rPr>
+        <w:t xml:space="preserve">MAE</w:t>
+      </w:r>
+      <w:r>
+        <w:rPr>
+          <w:rtl w:val="0"/>
+        </w:rPr>
+        <w:t xml:space="preserve"> respalda que las predicciones mantienen un nivel de error reducido sobre datos no utilizados durante el entrenamiento.</w:t>
+      </w:r>
+    </w:p>
+    <w:p>
+      <w:pPr>
+        <w:ind w:firstLine="720"/>
+        <w:rPr/>
+      </w:pPr>
+      <w:r>
+        <w:rPr>
+          <w:rtl w:val="0"/>
+        </w:rPr>
+        <w:t xml:space="preserve">Como validación cualitativa, se realizaron pruebas adicionales mediante la interfaz desarrollada en </w:t>
+      </w:r>
+      <w:r>
+        <w:rPr>
+          <w:b w:val="1"/>
+          <w:bCs w:val="1"/>
+          <w:rtl w:val="0"/>
+        </w:rPr>
+        <w:t xml:space="preserve">Gradio</w:t>
+      </w:r>
+      <w:r>
+        <w:rPr>
+          <w:rtl w:val="0"/>
+        </w:rPr>
+        <w:t xml:space="preserve">. En un primer caso, un adolescente con </w:t>
+      </w:r>
+      <w:r>
+        <w:rPr>
+          <w:b w:val="1"/>
+          <w:bCs w:val="1"/>
+          <w:rtl w:val="0"/>
+        </w:rPr>
+        <w:t xml:space="preserve">8 horas</w:t>
+      </w:r>
+      <w:r>
+        <w:rPr>
+          <w:rtl w:val="0"/>
+        </w:rPr>
+        <w:t xml:space="preserve"> de uso diario del teléfono, </w:t>
+      </w:r>
+      <w:r>
+        <w:rPr>
+          <w:b w:val="1"/>
+          <w:bCs w:val="1"/>
+          <w:rtl w:val="0"/>
+        </w:rPr>
+        <w:t xml:space="preserve">150 revisiones</w:t>
+      </w:r>
+      <w:r>
+        <w:rPr>
+          <w:rtl w:val="0"/>
+        </w:rPr>
+        <w:t xml:space="preserve"> al día y </w:t>
+      </w:r>
+      <w:r>
+        <w:rPr>
+          <w:b w:val="1"/>
+          <w:bCs w:val="1"/>
+          <w:rtl w:val="0"/>
+        </w:rPr>
+        <w:t xml:space="preserve">4 horas</w:t>
+      </w:r>
+      <w:r>
+        <w:rPr>
+          <w:rtl w:val="0"/>
+        </w:rPr>
+        <w:t xml:space="preserve"> de uso de redes sociales obtuvo una estimación de </w:t>
+      </w:r>
+      <w:r>
+        <w:rPr>
+          <w:b w:val="1"/>
+          <w:bCs w:val="1"/>
+          <w:rtl w:val="0"/>
+        </w:rPr>
+        <w:t xml:space="preserve">9.8</w:t>
+      </w:r>
+      <w:r>
+        <w:rPr>
+          <w:rtl w:val="0"/>
+        </w:rPr>
+        <w:t xml:space="preserve">, correspondiente a un nivel alto de adicción. En un segundo caso, un adolescente con </w:t>
+      </w:r>
+      <w:r>
+        <w:rPr>
+          <w:b w:val="1"/>
+          <w:bCs w:val="1"/>
+          <w:rtl w:val="0"/>
+        </w:rPr>
+        <w:t xml:space="preserve">2 horas</w:t>
+      </w:r>
+      <w:r>
+        <w:rPr>
+          <w:rtl w:val="0"/>
+        </w:rPr>
+        <w:t xml:space="preserve"> de uso diario, </w:t>
+      </w:r>
+      <w:r>
+        <w:rPr>
+          <w:b w:val="1"/>
+          <w:bCs w:val="1"/>
+          <w:rtl w:val="0"/>
+        </w:rPr>
+        <w:t xml:space="preserve">20 revisiones</w:t>
+      </w:r>
+      <w:r>
+        <w:rPr>
+          <w:rtl w:val="0"/>
+        </w:rPr>
+        <w:t xml:space="preserve"> del teléfono y </w:t>
+      </w:r>
+      <w:r>
+        <w:rPr>
+          <w:b w:val="1"/>
+          <w:bCs w:val="1"/>
+          <w:rtl w:val="0"/>
+        </w:rPr>
+        <w:t xml:space="preserve">7 horas</w:t>
+      </w:r>
+      <w:r>
+        <w:rPr>
+          <w:rtl w:val="0"/>
+        </w:rPr>
+        <w:t xml:space="preserve"> de sueño obtuvo una estimación de </w:t>
+      </w:r>
+      <w:r>
+        <w:rPr>
+          <w:b w:val="1"/>
+          <w:bCs w:val="1"/>
+          <w:rtl w:val="0"/>
+        </w:rPr>
+        <w:t xml:space="preserve">5.3</w:t>
+      </w:r>
+      <w:r>
+        <w:rPr>
+          <w:rtl w:val="0"/>
+        </w:rPr>
+        <w:t xml:space="preserve">, correspondiente a un nivel considerablemente menor de adicción. Ambos resultados son coherentes con el comportamiento esperado y muestran que el modelo responde adecuadamente a variaciones en las variables de entrada.</w:t>
+      </w:r>
+    </w:p>
+    <w:p>
+      <w:pPr>
+        <w:ind w:firstLine="720"/>
+        <w:rPr/>
+      </w:pPr>
+      <w:r>
+        <w:rPr>
+          <w:rtl w:val="0"/>
+        </w:rPr>
+        <w:t xml:space="preserve">Los resultados obtenidos son consistentes con investigaciones recientes sobre la predicción de la adicción al smartphone mediante técnicas de aprendizaje automático. En particular, Li et al. (2025) identifican la ansiedad y el afrontamiento emocional como factores centrales asociados a esta problemática, mientras que Liu et al. (2026) destacan la importancia de variables relacionadas con la intensidad de uso del teléfono inteligente, coincidiendo con las altas correlaciones observadas para </w:t>
+      </w:r>
+      <w:r>
+        <w:rPr>
+          <w:b w:val="1"/>
+          <w:bCs w:val="1"/>
+          <w:rtl w:val="0"/>
+        </w:rPr>
+        <w:t xml:space="preserve">Daily_Usage_Hours</w:t>
+      </w:r>
+      <w:r>
+        <w:rPr>
+          <w:rtl w:val="0"/>
+        </w:rPr>
+        <w:t xml:space="preserve"> y </w:t>
+      </w:r>
+      <w:r>
+        <w:rPr>
+          <w:b w:val="1"/>
+          <w:bCs w:val="1"/>
+          <w:rtl w:val="0"/>
+        </w:rPr>
+        <w:t xml:space="preserve">Time_on_Social_Media</w:t>
+      </w:r>
+      <w:r>
+        <w:rPr>
+          <w:rtl w:val="0"/>
+        </w:rPr>
+        <w:t xml:space="preserve"> en este estudio.</w:t>
+      </w:r>
+    </w:p>
+    <w:p>
+      <w:pPr>
+        <w:ind w:firstLine="720"/>
+        <w:rPr/>
+      </w:pPr>
+      <w:r>
+        <w:rPr>
+          <w:rtl w:val="0"/>
+        </w:rPr>
+        <w:t xml:space="preserve">Asimismo, la incorporación del nivel de ansiedad como variable predictora responde a la evidencia presentada por Zhou et al. (2025), quienes señalan que factores psicosociales como la rumiación y el acoso escolar constituyen predictores relevantes en adolescentes. De igual manera, la variable objetivo utilizada en este trabajo se fundamenta en instrumentos validados como la </w:t>
+      </w:r>
+      <w:r>
+        <w:rPr>
+          <w:b w:val="1"/>
+          <w:bCs w:val="1"/>
+          <w:rtl w:val="0"/>
+        </w:rPr>
+        <w:t xml:space="preserve">Smartphone Addiction Scale–Short Version (SAS-SV)</w:t>
+      </w:r>
+      <w:r>
+        <w:rPr>
+          <w:rtl w:val="0"/>
+        </w:rPr>
+        <w:t xml:space="preserve">, cuyas propiedades psicométricas han sido confirmadas en población hispanohablante (Hidalgo-Fuentes et al., 2025), aportando solidez a la medición del nivel de adicción. En conjunto, el elevado valor de </w:t>
+      </w:r>
+      <w:r>
+        <w:rPr>
+          <w:b w:val="1"/>
+          <w:bCs w:val="1"/>
+          <w:rtl w:val="0"/>
+        </w:rPr>
+        <w:t xml:space="preserve">R²</w:t>
+      </w:r>
+      <w:r>
+        <w:rPr>
+          <w:rtl w:val="0"/>
+        </w:rPr>
+        <w:t xml:space="preserve"> y el bajo </w:t>
+      </w:r>
+      <w:r>
+        <w:rPr>
+          <w:b w:val="1"/>
+          <w:bCs w:val="1"/>
+          <w:rtl w:val="0"/>
+        </w:rPr>
+        <w:t xml:space="preserve">MAE</w:t>
+      </w:r>
+      <w:r>
+        <w:rPr>
+          <w:rtl w:val="0"/>
+        </w:rPr>
+        <w:t xml:space="preserve"> obtenidos son coherentes con el desempeño reportado por estudios recientes que comparan múltiples modelos de aprendizaje automático para esta misma problemática (K. S. et al., 2025).</w:t>
+      </w:r>
+    </w:p>
+    <w:p>
+      <w:pPr>
+        <w:ind w:firstLine="720"/>
+        <w:rPr/>
+      </w:pPr>
+      <w:r>
+        <w:rPr>
+          <w:rtl w:val="0"/>
+        </w:rPr>
+        <w:t xml:space="preserve">Como principal limitación, el modelo depende de la calidad y consistencia de los datos proporcionados por el usuario. La presencia de valores atípicos, inconsistentes o fuera del rango observado durante el entrenamiento puede afectar la precisión de las predicciones. Además, el modelo fue entrenado utilizando un único conjunto de datos obtenido mediante encuestas, por lo que su capacidad de generalización a otras poblaciones, contextos culturales o grupos etarios deberá evaluarse mediante estudios adicionales.</w:t>
+      </w:r>
+    </w:p>
+    <w:p>
+      <w:pPr>
+        <w:ind w:firstLine="720"/>
+        <w:rPr/>
+      </w:pPr>
+      <w:r>
+        <w:rPr>
+          <w:rtl w:val="0"/>
+        </w:rPr>
+        <w:t xml:space="preserve">No obstante, el preprocesamiento de los datos mediante </w:t>
+      </w:r>
+      <w:r>
+        <w:rPr>
+          <w:b w:val="1"/>
+          <w:bCs w:val="1"/>
+          <w:rtl w:val="0"/>
+        </w:rPr>
+        <w:t xml:space="preserve">One-Hot Encoding</w:t>
+      </w:r>
+      <w:r>
+        <w:rPr>
+          <w:rtl w:val="0"/>
+        </w:rPr>
+        <w:t xml:space="preserve">, la estandarización de las variables numéricas con </w:t>
+      </w:r>
+      <w:r>
+        <w:rPr>
+          <w:b w:val="1"/>
+          <w:bCs w:val="1"/>
+          <w:rtl w:val="0"/>
+        </w:rPr>
+        <w:t xml:space="preserve">StandardScaler</w:t>
+      </w:r>
+      <w:r>
+        <w:rPr>
+          <w:rtl w:val="0"/>
+        </w:rPr>
+        <w:t xml:space="preserve"> y la incorporación de regularización </w:t>
+      </w:r>
+      <w:r>
+        <w:rPr>
+          <w:b w:val="1"/>
+          <w:bCs w:val="1"/>
+          <w:rtl w:val="0"/>
+        </w:rPr>
+        <w:t xml:space="preserve">L2</w:t>
+      </w:r>
+      <w:r>
+        <w:rPr>
+          <w:rtl w:val="0"/>
+        </w:rPr>
+        <w:t xml:space="preserve"> contribuyen a mejorar la estabilidad del modelo y su capacidad para generar predicciones consistentes frente a nuevos casos. En conjunto, los resultados obtenidos muestran que la Red Neuronal Artificial propuesta constituye una herramienta viable para estimar el nivel de adicción al teléfono inteligente dentro de las características y limitaciones del conjunto de datos utilizado.</w:t>
+      </w:r>
+    </w:p>
+    <w:p>
+      <w:pPr>
+        <w:pStyle w:val="Heading3"/>
+        <w:rPr/>
+      </w:pPr>
+      <w:bookmarkStart w:colFirst="0" w:colLast="0" w:name="_r6etvpsxyux4" w:id="8"/>
+      <w:bookmarkEnd w:id="8"/>
+      <w:r>
+        <w:rPr>
+          <w:rtl w:val="0"/>
+        </w:rPr>
+        <w:t xml:space="preserve">5.1 Clasificación binaria y matriz de confusión</w:t>
+      </w:r>
+    </w:p>
+    <w:p>
+      <w:pPr>
+        <w:ind w:firstLine="720"/>
+        <w:rPr/>
+      </w:pPr>
+      <w:r>
+        <w:rPr>
+          <w:rtl w:val="0"/>
+        </w:rPr>
+        <w:t xml:space="preserve">Si bien el modelo fue diseñado como un problema de regresión, resulta útil evaluar su desempeño desde una perspectiva de clasificación, dado que en la práctica el objetivo suele ser identificar si un adolescente se encuentra o no en riesgo de adicción. Para ello, se definió un umbral de </w:t>
+      </w:r>
+      <w:r>
+        <w:rPr>
+          <w:b w:val="1"/>
+          <w:bCs w:val="1"/>
+          <w:rtl w:val="0"/>
+        </w:rPr>
+        <w:t xml:space="preserve">6.0</w:t>
+      </w:r>
+      <w:r>
+        <w:rPr>
+          <w:rtl w:val="0"/>
+        </w:rPr>
+        <w:t xml:space="preserve"> sobre la variable </w:t>
+      </w:r>
+      <w:r>
+        <w:rPr>
+          <w:b w:val="1"/>
+          <w:bCs w:val="1"/>
+          <w:rtl w:val="0"/>
+        </w:rPr>
+        <w:t xml:space="preserve">Addiction_Level</w:t>
+      </w:r>
+      <w:r>
+        <w:rPr>
+          <w:rtl w:val="0"/>
+        </w:rPr>
+        <w:t xml:space="preserve">, de manera que los valores iguales o superiores se clasifican como </w:t>
+      </w:r>
+      <w:r>
+        <w:rPr>
+          <w:b w:val="1"/>
+          <w:bCs w:val="1"/>
+          <w:rtl w:val="0"/>
+        </w:rPr>
+        <w:t xml:space="preserve">"Adicto"</w:t>
+      </w:r>
+      <w:r>
+        <w:rPr>
+          <w:rtl w:val="0"/>
+        </w:rPr>
+        <w:t xml:space="preserve"> y los valores inferiores como </w:t>
+      </w:r>
+      <w:r>
+        <w:rPr>
+          <w:b w:val="1"/>
+          <w:bCs w:val="1"/>
+          <w:rtl w:val="0"/>
+        </w:rPr>
+        <w:t xml:space="preserve">"No Adicto"</w:t>
+      </w:r>
+      <w:r>
+        <w:rPr>
+          <w:rtl w:val="0"/>
+        </w:rPr>
+        <w:t xml:space="preserve">. Este umbral se aplicó tanto a los valores reales como a las predicciones continuas del modelo </w:t>
+      </w:r>
+      <w:r>
+        <w:rPr>
+          <w:b w:val="1"/>
+          <w:bCs w:val="1"/>
+          <w:rtl w:val="0"/>
+        </w:rPr>
+        <w:t xml:space="preserve">MLPRegressor</w:t>
+      </w:r>
+      <w:r>
+        <w:rPr>
+          <w:rtl w:val="0"/>
+        </w:rPr>
+        <w:t xml:space="preserve">, lo que permitió construir una matriz de confusión y calcular métricas de clasificación estándar.</w:t>
+      </w:r>
+    </w:p>
+    <w:p>
+      <w:pPr>
+        <w:spacing w:after="240" w:before="240" w:lineRule="auto"/>
+        <w:rPr/>
+      </w:pPr>
+      <w:r>
+        <w:rPr>
+          <w:b w:val="1"/>
+          <w:bCs w:val="1"/>
+          <w:rtl w:val="0"/>
+        </w:rPr>
+        <w:t xml:space="preserve">Figura 5.</w:t>
+      </w:r>
+      <w:r>
+        <w:rPr>
+          <w:rFonts w:ascii="Gungsuh" w:cs="Gungsuh" w:eastAsia="Gungsuh" w:hAnsi="Gungsuh"/>
+          <w:rtl w:val="0"/>
+        </w:rPr>
+        <w:t xml:space="preserve"> Matriz de confusión del modelo MLP (Adicto ≥ 6.0).</w:t>
+      </w:r>
+    </w:p>
+    <w:p>
+      <w:pPr>
+        <w:jc w:val="center"/>
+        <w:rPr/>
+      </w:pPr>
+      <w:r>
+        <w:rPr/>
+        <w:drawing>
+          <wp:inline distB="114300" distT="114300" distL="114300" distR="114300">
+            <wp:extent cx="4572000" cy="3847723"/>
+            <wp:effectExtent b="0" l="0" r="0" t="0"/>
+            <wp:docPr id="5" name="image4.png"/>
+            <a:graphic>
+              <a:graphicData uri="http://schemas.openxmlformats.org/drawingml/2006/picture">
+                <pic:pic>
+                  <pic:nvPicPr>
+                    <pic:cNvPr id="0" name="image4.png"/>
+                    <pic:cNvPicPr preferRelativeResize="0"/>
+                  </pic:nvPicPr>
+                  <pic:blipFill>
+                    <a:blip r:embed="rId11"/>
+                    <a:srcRect b="0" l="0" r="0" t="0"/>
+                    <a:stretch>
+                      <a:fillRect/>
+                    </a:stretch>
+                  </pic:blipFill>
+                  <pic:spPr>
+                    <a:xfrm>
+                      <a:off x="0" y="0"/>
+                      <a:ext cx="4572000" cy="3847723"/>
+                    </a:xfrm>
+                    <a:prstGeom prst="rect"/>
+                    <a:ln/>
+                  </pic:spPr>
+                </pic:pic>
+              </a:graphicData>
+            </a:graphic>
+          </wp:inline>
+        </w:drawing>
+      </w:r>
+      <w:r>
+        <w:rPr>
+          <w:rtl w:val="0"/>
+        </w:rPr>
+      </w:r>
+    </w:p>
+    <w:p>
+      <w:pPr>
+        <w:spacing w:after="240" w:before="240" w:lineRule="auto"/>
+        <w:ind w:firstLine="720"/>
+        <w:rPr/>
+      </w:pPr>
+      <w:r>
+        <w:rPr>
+          <w:rtl w:val="0"/>
+        </w:rPr>
+        <w:t xml:space="preserve">Las métricas de clasificación obtenidas sobre el conjunto de prueba (600 registros) fueron las siguientes:</w:t>
+      </w:r>
+    </w:p>
+    <w:p>
+      <w:pPr>
+        <w:numPr>
+          <w:ilvl w:val="0"/>
+          <w:numId w:val="5"/>
+        </w:numPr>
+        <w:spacing w:after="0" w:afterAutospacing="0" w:before="240" w:lineRule="auto"/>
+        <w:ind w:left="720" w:hanging="360"/>
+      </w:pPr>
+      <w:r>
+        <w:rPr>
+          <w:b w:val="1"/>
+          <w:bCs w:val="1"/>
+          <w:rtl w:val="0"/>
+        </w:rPr>
+        <w:t xml:space="preserve">Exactitud (Accuracy):</w:t>
+      </w:r>
+      <w:r>
+        <w:rPr>
+          <w:rtl w:val="0"/>
+        </w:rPr>
+        <w:t xml:space="preserve"> 0.983</w:t>
+      </w:r>
+    </w:p>
+    <w:p>
+      <w:pPr>
+        <w:numPr>
+          <w:ilvl w:val="0"/>
+          <w:numId w:val="5"/>
+        </w:numPr>
+        <w:spacing w:after="0" w:afterAutospacing="0" w:before="0" w:beforeAutospacing="0" w:lineRule="auto"/>
+        <w:ind w:left="720" w:hanging="360"/>
+      </w:pPr>
+      <w:r>
+        <w:rPr>
+          <w:b w:val="1"/>
+          <w:bCs w:val="1"/>
+          <w:rtl w:val="0"/>
+        </w:rPr>
+        <w:t xml:space="preserve">Precisión (Precision):</w:t>
+      </w:r>
+      <w:r>
+        <w:rPr>
+          <w:rtl w:val="0"/>
+        </w:rPr>
+        <w:t xml:space="preserve"> 0.993</w:t>
+      </w:r>
+    </w:p>
+    <w:p>
+      <w:pPr>
+        <w:numPr>
+          <w:ilvl w:val="0"/>
+          <w:numId w:val="5"/>
+        </w:numPr>
+        <w:spacing w:after="0" w:afterAutospacing="0" w:before="0" w:beforeAutospacing="0" w:lineRule="auto"/>
+        <w:ind w:left="720" w:hanging="360"/>
+      </w:pPr>
+      <w:r>
+        <w:rPr>
+          <w:b w:val="1"/>
+          <w:bCs w:val="1"/>
+          <w:rtl w:val="0"/>
+        </w:rPr>
+        <w:t xml:space="preserve">Sensibilidad (Recall):</w:t>
+      </w:r>
+      <w:r>
+        <w:rPr>
+          <w:rtl w:val="0"/>
+        </w:rPr>
+        <w:t xml:space="preserve"> 0.989</w:t>
+      </w:r>
+    </w:p>
+    <w:p>
+      <w:pPr>
+        <w:numPr>
+          <w:ilvl w:val="0"/>
+          <w:numId w:val="5"/>
+        </w:numPr>
+        <w:spacing w:after="0" w:afterAutospacing="0" w:before="0" w:beforeAutospacing="0" w:lineRule="auto"/>
+        <w:ind w:left="720" w:hanging="360"/>
+      </w:pPr>
+      <w:r>
+        <w:rPr>
+          <w:b w:val="1"/>
+          <w:bCs w:val="1"/>
+          <w:rtl w:val="0"/>
+        </w:rPr>
+        <w:t xml:space="preserve">F1-Score:</w:t>
+      </w:r>
+      <w:r>
+        <w:rPr>
+          <w:rtl w:val="0"/>
+        </w:rPr>
+        <w:t xml:space="preserve"> 0.991</w:t>
+      </w:r>
+    </w:p>
+    <w:p>
+      <w:pPr>
+        <w:numPr>
+          <w:ilvl w:val="0"/>
+          <w:numId w:val="5"/>
+        </w:numPr>
+        <w:spacing w:after="240" w:before="0" w:beforeAutospacing="0" w:lineRule="auto"/>
+        <w:ind w:left="720" w:hanging="360"/>
+      </w:pPr>
+      <w:r>
+        <w:rPr>
+          <w:b w:val="1"/>
+          <w:bCs w:val="1"/>
+          <w:rtl w:val="0"/>
+        </w:rPr>
+        <w:t xml:space="preserve">AUC-ROC:</w:t>
+      </w:r>
+      <w:r>
+        <w:rPr>
+          <w:rtl w:val="0"/>
+        </w:rPr>
+        <w:t xml:space="preserve"> 0.998</w:t>
+      </w:r>
+    </w:p>
+    <w:p>
+      <w:pPr>
+        <w:spacing w:after="240" w:before="240" w:lineRule="auto"/>
+        <w:ind w:firstLine="720"/>
+        <w:rPr/>
+      </w:pPr>
+      <w:r>
+        <w:rPr>
+          <w:rtl w:val="0"/>
+        </w:rPr>
+        <w:t xml:space="preserve">El reporte de clasificación detallado muestra que el modelo identifica correctamente al 99 % de los adolescentes con adicción (</w:t>
+      </w:r>
+      <w:r>
+        <w:rPr>
+          <w:i w:val="1"/>
+          <w:iCs w:val="1"/>
+          <w:rtl w:val="0"/>
+        </w:rPr>
+        <w:t xml:space="preserve">Recall</w:t>
+      </w:r>
+      <w:r>
+        <w:rPr>
+          <w:rtl w:val="0"/>
+        </w:rPr>
+        <w:t xml:space="preserve"> = 0.99 para la clase "Adicto"), mientras que para la clase minoritaria "No Adicto" (39 casos de 600) se obtuvo una precisión de 0.85 y un recall de 0.90. Esta diferencia es consistente con el desbalance de clases observado en la Figura 2, donde más del 50 % de los registros corresponde al nivel máximo de adicción: al haber muchos menos ejemplos de la clase "No Adicto", el modelo dispone de menos información para aprender sus patrones, lo que se traduce en un desempeño ligeramente inferior para esa clase específica, aunque sigue siendo satisfactorio.</w:t>
+      </w:r>
+    </w:p>
+    <w:p>
+      <w:pPr>
+        <w:spacing w:after="240" w:before="240" w:lineRule="auto"/>
+        <w:ind w:firstLine="720"/>
+        <w:rPr/>
+      </w:pPr>
+      <w:r>
+        <w:rPr>
+          <w:rtl w:val="0"/>
+        </w:rPr>
+        <w:t xml:space="preserve">Adicionalmente, se evaluó cómo varían las métricas de clasificación al modificar el umbral de decisión entre 3.0 y 8.0.</w:t>
+      </w:r>
+    </w:p>
+    <w:p>
+      <w:pPr>
+        <w:spacing w:after="240" w:before="240" w:lineRule="auto"/>
+        <w:rPr/>
+      </w:pPr>
+      <w:r>
+        <w:rPr>
+          <w:b w:val="1"/>
+          <w:bCs w:val="1"/>
+          <w:rtl w:val="0"/>
+        </w:rPr>
+        <w:t xml:space="preserve">Figura 6.</w:t>
+      </w:r>
+      <w:r>
+        <w:rPr>
+          <w:rtl w:val="0"/>
+        </w:rPr>
+        <w:t xml:space="preserve"> Métricas de clasificación en función del umbral de decisión.</w:t>
+      </w:r>
+    </w:p>
+    <w:p>
+      <w:pPr>
+        <w:jc w:val="center"/>
+        <w:rPr/>
+      </w:pPr>
+      <w:r>
+        <w:rPr/>
+        <w:drawing>
+          <wp:inline distB="114300" distT="114300" distL="114300" distR="114300">
+            <wp:extent cx="4572000" cy="3038622"/>
+            <wp:effectExtent b="0" l="0" r="0" t="0"/>
+            <wp:docPr id="6" name="image7.png"/>
+            <a:graphic>
+              <a:graphicData uri="http://schemas.openxmlformats.org/drawingml/2006/picture">
+                <pic:pic>
+                  <pic:nvPicPr>
+                    <pic:cNvPr id="0" name="image7.png"/>
+                    <pic:cNvPicPr preferRelativeResize="0"/>
+                  </pic:nvPicPr>
+                  <pic:blipFill>
+                    <a:blip r:embed="rId12"/>
+                    <a:srcRect b="0" l="0" r="0" t="0"/>
+                    <a:stretch>
+                      <a:fillRect/>
+                    </a:stretch>
+                  </pic:blipFill>
+                  <pic:spPr>
+                    <a:xfrm>
+                      <a:off x="0" y="0"/>
+                      <a:ext cx="4572000" cy="3038622"/>
+                    </a:xfrm>
+                    <a:prstGeom prst="rect"/>
+                    <a:ln/>
+                  </pic:spPr>
+                </pic:pic>
+              </a:graphicData>
+            </a:graphic>
+          </wp:inline>
+        </w:drawing>
+      </w:r>
+      <w:r>
+        <w:rPr>
+          <w:rtl w:val="0"/>
+        </w:rPr>
+      </w:r>
+    </w:p>
+    <w:p>
+      <w:pPr>
+        <w:ind w:firstLine="720"/>
+        <w:jc w:val="left"/>
+        <w:rPr/>
+      </w:pPr>
+      <w:r>
+        <w:rPr>
+          <w:rtl w:val="0"/>
+        </w:rPr>
+        <w:t xml:space="preserve">Este análisis de sensibilidad muestra que las métricas de clasificación son altas y muy estables para umbrales entre 3.0 y 5.5 (todas por encima de 0.995), pero presentan una caída y mayor oscilación a partir de un umbral de 6.0, especialmente en </w:t>
+      </w:r>
+      <w:r>
+        <w:rPr>
+          <w:i w:val="1"/>
+          <w:iCs w:val="1"/>
+          <w:rtl w:val="0"/>
+        </w:rPr>
+        <w:t xml:space="preserve">Accuracy</w:t>
+      </w:r>
+      <w:r>
+        <w:rPr>
+          <w:rtl w:val="0"/>
+        </w:rPr>
+        <w:t xml:space="preserve"> y </w:t>
+      </w:r>
+      <w:r>
+        <w:rPr>
+          <w:i w:val="1"/>
+          <w:iCs w:val="1"/>
+          <w:rtl w:val="0"/>
+        </w:rPr>
+        <w:t xml:space="preserve">Recall</w:t>
+      </w:r>
+      <w:r>
+        <w:rPr>
+          <w:rtl w:val="0"/>
+        </w:rPr>
+        <w:t xml:space="preserve">, que llegan a descender hasta valores cercanos a 0.978–0.980 en el umbral de 8.0. Esta pérdida de estabilidad no se debe a que los niveles altos de adicción sean intrínsecamente más difíciles de predecir, sino al fuerte desbalance de clases descrito previamente: al desplazar el umbral hacia valores más altos, la clase "No Adicto" incorpora progresivamente casos de adicción moderada que antes se agrupaban con la clase "Adicto", generando una frontera de decisión menos nítida y con menor cantidad de ejemplos de entrenamiento en esa región del espacio de salida. En consecuencia, pequeñas variaciones en las predicciones continuas del MLP se traducen en errores de clasificación más frecuentes conforme el umbral se acerca a los extremos de la distribución de </w:t>
+      </w:r>
+      <w:r>
+        <w:rPr>
+          <w:b w:val="1"/>
+          <w:bCs w:val="1"/>
+          <w:rtl w:val="0"/>
+        </w:rPr>
+        <w:t xml:space="preserve">Addiction_Level</w:t>
+      </w:r>
+      <w:r>
+        <w:rPr>
+          <w:rtl w:val="0"/>
+        </w:rPr>
+        <w:t xml:space="preserve">. Este comportamiento respalda la elección del umbral de 6.0, situado en el límite superior de la región más estable, y sugiere que umbrales más altos deberían interpretarse con mayor cautela si se utilizaran en una futura versión del sistema.</w:t>
+      </w:r>
+    </w:p>
+    <w:p>
+      <w:pPr>
+        <w:pStyle w:val="Heading3"/>
+        <w:rPr/>
+      </w:pPr>
+      <w:bookmarkStart w:colFirst="0" w:colLast="0" w:name="_jfscg4ieemho" w:id="9"/>
+      <w:bookmarkEnd w:id="9"/>
+      <w:r>
+        <w:rPr>
+          <w:rtl w:val="0"/>
+        </w:rPr>
+        <w:t xml:space="preserve">5.2 Comparación con un modelo de Regresión Lineal</w:t>
+      </w:r>
+    </w:p>
+    <w:p>
+      <w:pPr>
+        <w:spacing w:after="240" w:before="240" w:lineRule="auto"/>
+        <w:ind w:firstLine="720"/>
+        <w:rPr/>
+      </w:pPr>
+      <w:r>
+        <w:rPr>
+          <w:rtl w:val="0"/>
+        </w:rPr>
+        <w:t xml:space="preserve">Con el propósito de contextualizar el desempeño del modelo </w:t>
+      </w:r>
+      <w:r>
+        <w:rPr>
+          <w:b w:val="1"/>
+          <w:bCs w:val="1"/>
+          <w:rtl w:val="0"/>
+        </w:rPr>
+        <w:t xml:space="preserve">MLPRegressor</w:t>
+      </w:r>
+      <w:r>
+        <w:rPr>
+          <w:rtl w:val="0"/>
+        </w:rPr>
+        <w:t xml:space="preserve"> y evaluar si la complejidad adicional de una red neuronal se traduce en una mejora real frente a un enfoque más simple, se entrenó un modelo de </w:t>
+      </w:r>
+      <w:r>
+        <w:rPr>
+          <w:b w:val="1"/>
+          <w:bCs w:val="1"/>
+          <w:rtl w:val="0"/>
+        </w:rPr>
+        <w:t xml:space="preserve">Regresión Lineal Múltiple</w:t>
+      </w:r>
+      <w:r>
+        <w:rPr>
+          <w:rtl w:val="0"/>
+        </w:rPr>
+        <w:t xml:space="preserve"> como línea base (</w:t>
+      </w:r>
+      <w:r>
+        <w:rPr>
+          <w:i w:val="1"/>
+          <w:iCs w:val="1"/>
+          <w:rtl w:val="0"/>
+        </w:rPr>
+        <w:t xml:space="preserve">baseline</w:t>
+      </w:r>
+      <w:r>
+        <w:rPr>
+          <w:rtl w:val="0"/>
+        </w:rPr>
+        <w:t xml:space="preserve">). A diferencia del MLP, las variables numéricas no fueron estandarizadas en este caso, con el fin de que los coeficientes resultantes pudieran interpretarse directamente en las unidades originales de cada variable.</w:t>
+      </w:r>
+    </w:p>
+    <w:p>
+      <w:pPr>
+        <w:spacing w:after="240" w:before="240" w:lineRule="auto"/>
+        <w:ind w:firstLine="720"/>
+        <w:rPr/>
+      </w:pPr>
+      <w:r>
+        <w:rPr>
+          <w:rtl w:val="0"/>
+        </w:rPr>
+        <w:t xml:space="preserve">El modelo de Regresión Lineal obtuvo los siguientes resultados sobre el conjunto de prueba, tras recortar las predicciones al rango válido de 0 a 10:</w:t>
       </w:r>
     </w:p>
     <w:p>
@@ -2734,289 +4203,32 @@
           <w:ilvl w:val="0"/>
           <w:numId w:val="1"/>
         </w:numPr>
-        <w:spacing w:before="0" w:beforeAutospacing="0"/>
+        <w:spacing w:after="0" w:afterAutospacing="0" w:before="240" w:lineRule="auto"/>
         <w:ind w:left="720" w:hanging="360"/>
-        <w:rPr>
-          <w:u w:val="none"/>
-        </w:rPr>
-      </w:pPr>
-      <w:r>
-        <w:rPr>
-          <w:b w:val="1"/>
-          <w:bCs w:val="1"/>
-          <w:rtl w:val="0"/>
-        </w:rPr>
-        <w:t xml:space="preserve">Sección avanzada (opcional):</w:t>
-      </w:r>
-      <w:r>
-        <w:rPr>
-          <w:rtl w:val="0"/>
-        </w:rPr>
-        <w:t xml:space="preserve"> incorpora el resto de las variables demográficas y psicosociales consideradas por el modelo, como la edad, el género, el nivel de ansiedad, la autoestima o el control parental. Cuando el usuario desconoce alguno de estos valores, la aplicación emplea valores de referencia obtenidos del conjunto de datos para completar la información requerida sin interrumpir el proceso de predicción.</w:t>
-      </w:r>
-    </w:p>
-    <w:p>
-      <w:pPr>
-        <w:rPr>
-          <w:b w:val="1"/>
-          <w:bCs w:val="1"/>
-        </w:rPr>
-      </w:pPr>
-      <w:r>
-        <w:rPr>
-          <w:rtl w:val="0"/>
-        </w:rPr>
-        <w:t xml:space="preserve">El sistema fue desarrollado en </w:t>
-      </w:r>
-      <w:r>
-        <w:rPr>
-          <w:b w:val="1"/>
-          <w:bCs w:val="1"/>
-          <w:rtl w:val="0"/>
-        </w:rPr>
-        <w:t xml:space="preserve">Python</w:t>
-      </w:r>
-      <w:r>
-        <w:rPr>
-          <w:rtl w:val="0"/>
-        </w:rPr>
-        <w:t xml:space="preserve">, empleando </w:t>
-      </w:r>
-      <w:r>
-        <w:rPr>
-          <w:b w:val="1"/>
-          <w:bCs w:val="1"/>
-          <w:rtl w:val="0"/>
-        </w:rPr>
-        <w:t xml:space="preserve">scikit-learn</w:t>
-      </w:r>
-      <w:r>
-        <w:rPr>
-          <w:rtl w:val="0"/>
-        </w:rPr>
-        <w:t xml:space="preserve"> para la implementación de la Red Neuronal Artificial (</w:t>
-      </w:r>
-      <w:r>
-        <w:rPr>
-          <w:b w:val="1"/>
-          <w:bCs w:val="1"/>
-          <w:rtl w:val="0"/>
-        </w:rPr>
-        <w:t xml:space="preserve">MLPRegressor</w:t>
-      </w:r>
-      <w:r>
-        <w:rPr>
-          <w:rtl w:val="0"/>
-        </w:rPr>
-        <w:t xml:space="preserve">), </w:t>
-      </w:r>
-      <w:r>
-        <w:rPr>
-          <w:b w:val="1"/>
-          <w:bCs w:val="1"/>
-          <w:rtl w:val="0"/>
-        </w:rPr>
-        <w:t xml:space="preserve">pandas</w:t>
-      </w:r>
-      <w:r>
-        <w:rPr>
-          <w:rtl w:val="0"/>
-        </w:rPr>
-        <w:t xml:space="preserve"> para la manipulación del conjunto de datos, </w:t>
-      </w:r>
-      <w:r>
-        <w:rPr>
-          <w:b w:val="1"/>
-          <w:bCs w:val="1"/>
-          <w:rtl w:val="0"/>
-        </w:rPr>
-        <w:t xml:space="preserve">NumPy</w:t>
-      </w:r>
-      <w:r>
-        <w:rPr>
-          <w:rtl w:val="0"/>
-        </w:rPr>
-        <w:t xml:space="preserve"> para las operaciones numéricas y </w:t>
-      </w:r>
-      <w:r>
-        <w:rPr>
-          <w:b w:val="1"/>
-          <w:bCs w:val="1"/>
-          <w:rtl w:val="0"/>
-        </w:rPr>
-        <w:t xml:space="preserve">Gradio</w:t>
-      </w:r>
-      <w:r>
-        <w:rPr>
-          <w:rtl w:val="0"/>
-        </w:rPr>
-        <w:t xml:space="preserve"> para el desarrollo de la interfaz web. La aplicación fue diseñada para ejecutarse en cualquier entorno compatible con </w:t>
-      </w:r>
-      <w:r>
-        <w:rPr>
-          <w:b w:val="1"/>
-          <w:bCs w:val="1"/>
-          <w:rtl w:val="0"/>
-        </w:rPr>
-        <w:t xml:space="preserve">Python 3.14</w:t>
-      </w:r>
-      <w:r>
-        <w:rPr>
-          <w:rtl w:val="0"/>
-        </w:rPr>
-        <w:t xml:space="preserve"> o superior, facilitando su instalación y posterior despliegue.</w:t>
-      </w:r>
-      <w:r>
-        <w:rPr>
-          <w:rtl w:val="0"/>
-        </w:rPr>
-      </w:r>
-    </w:p>
-    <w:p>
-      <w:pPr>
-        <w:pStyle w:val="Heading2"/>
-        <w:rPr/>
-      </w:pPr>
-      <w:bookmarkStart w:colFirst="0" w:colLast="0" w:name="_az5usi8kpkbn" w:id="7"/>
-      <w:bookmarkEnd w:id="7"/>
-      <w:r>
-        <w:rPr>
-          <w:rtl w:val="0"/>
-        </w:rPr>
-        <w:t xml:space="preserve">5. Validación de resultados y pruebas</w:t>
-      </w:r>
-    </w:p>
-    <w:p>
-      <w:pPr>
-        <w:ind w:firstLine="720"/>
-        <w:rPr/>
-      </w:pPr>
-      <w:r>
-        <w:rPr>
-          <w:rtl w:val="0"/>
-        </w:rPr>
-        <w:t xml:space="preserve">El modelo fue evaluado utilizando el </w:t>
-      </w:r>
-      <w:r>
-        <w:rPr>
-          <w:b w:val="1"/>
-          <w:bCs w:val="1"/>
-          <w:rtl w:val="0"/>
-        </w:rPr>
-        <w:t xml:space="preserve">20 %</w:t>
-      </w:r>
-      <w:r>
-        <w:rPr>
-          <w:rtl w:val="0"/>
-        </w:rPr>
-        <w:t xml:space="preserve"> del conjunto de datos reservado para prueba, correspondiente a </w:t>
-      </w:r>
-      <w:r>
-        <w:rPr>
-          <w:b w:val="1"/>
-          <w:bCs w:val="1"/>
-          <w:rtl w:val="0"/>
-        </w:rPr>
-        <w:t xml:space="preserve">600 registros</w:t>
-      </w:r>
-      <w:r>
-        <w:rPr>
-          <w:rtl w:val="0"/>
-        </w:rPr>
-        <w:t xml:space="preserve">. Para medir su desempeño se emplearon dos métricas ampliamente utilizadas en problemas de regresión: el </w:t>
-      </w:r>
-      <w:r>
-        <w:rPr>
-          <w:b w:val="1"/>
-          <w:bCs w:val="1"/>
-          <w:rtl w:val="0"/>
-        </w:rPr>
-        <w:t xml:space="preserve">Coeficiente de Determinación (R²)</w:t>
-      </w:r>
-      <w:r>
-        <w:rPr>
-          <w:rtl w:val="0"/>
-        </w:rPr>
-        <w:t xml:space="preserve"> y el </w:t>
-      </w:r>
-      <w:r>
-        <w:rPr>
-          <w:b w:val="1"/>
-          <w:bCs w:val="1"/>
-          <w:rtl w:val="0"/>
-        </w:rPr>
-        <w:t xml:space="preserve">Error Absoluto Medio (MAE)</w:t>
-      </w:r>
-      <w:r>
-        <w:rPr>
-          <w:rtl w:val="0"/>
-        </w:rPr>
-        <w:t xml:space="preserve">.</w:t>
-      </w:r>
-    </w:p>
-    <w:p>
-      <w:pPr>
-        <w:ind w:firstLine="720"/>
-        <w:rPr/>
-      </w:pPr>
-      <w:r>
-        <w:rPr>
-          <w:rtl w:val="0"/>
-        </w:rPr>
-        <w:t xml:space="preserve">Las métricas obtenidas fueron las siguientes:</w:t>
+      </w:pPr>
+      <w:r>
+        <w:rPr>
+          <w:b w:val="1"/>
+          <w:bCs w:val="1"/>
+          <w:rtl w:val="0"/>
+        </w:rPr>
+        <w:t xml:space="preserve">Coeficiente de determinación (R²):</w:t>
+      </w:r>
+      <w:r>
+        <w:rPr>
+          <w:rtl w:val="0"/>
+        </w:rPr>
+        <w:t xml:space="preserve"> 0.826</w:t>
       </w:r>
     </w:p>
     <w:p>
       <w:pPr>
         <w:numPr>
           <w:ilvl w:val="0"/>
-          <w:numId w:val="3"/>
+          <w:numId w:val="1"/>
         </w:numPr>
-        <w:spacing w:after="0" w:afterAutospacing="0"/>
+        <w:spacing w:after="240" w:before="0" w:beforeAutospacing="0" w:lineRule="auto"/>
         <w:ind w:left="720" w:hanging="360"/>
-        <w:rPr>
-          <w:u w:val="none"/>
-        </w:rPr>
-      </w:pPr>
-      <w:r>
-        <w:rPr>
-          <w:b w:val="1"/>
-          <w:bCs w:val="1"/>
-          <w:rtl w:val="0"/>
-        </w:rPr>
-        <w:t xml:space="preserve">Coeficiente de determinación (R²):</w:t>
-      </w:r>
-      <w:r>
-        <w:rPr>
-          <w:rtl w:val="0"/>
-        </w:rPr>
-        <w:t xml:space="preserve"> </w:t>
-      </w:r>
-      <w:r>
-        <w:rPr>
-          <w:b w:val="1"/>
-          <w:bCs w:val="1"/>
-          <w:rtl w:val="0"/>
-        </w:rPr>
-        <w:t xml:space="preserve">0.987</w:t>
-      </w:r>
-      <w:r>
-        <w:rPr>
-          <w:rtl w:val="0"/>
-        </w:rPr>
-      </w:r>
-    </w:p>
-    <w:p>
-      <w:pPr>
-        <w:numPr>
-          <w:ilvl w:val="0"/>
-          <w:numId w:val="3"/>
-        </w:numPr>
-        <w:spacing w:before="0" w:beforeAutospacing="0"/>
-        <w:ind w:left="720" w:hanging="360"/>
-        <w:rPr>
-          <w:u w:val="none"/>
-        </w:rPr>
       </w:pPr>
       <w:r>
         <w:rPr>
@@ -3030,24 +4242,12 @@
         <w:rPr>
           <w:rtl w:val="0"/>
         </w:rPr>
-        <w:t xml:space="preserve"> </w:t>
-      </w:r>
-      <w:r>
-        <w:rPr>
-          <w:b w:val="1"/>
-          <w:bCs w:val="1"/>
-          <w:rtl w:val="0"/>
-        </w:rPr>
-        <w:t xml:space="preserve">0.146</w:t>
-      </w:r>
-      <w:r>
-        <w:rPr>
-          <w:rtl w:val="0"/>
-        </w:rPr>
-      </w:r>
-    </w:p>
-    <w:p>
-      <w:pPr>
+        <w:t xml:space="preserve"> 0.472</w:t>
+      </w:r>
+    </w:p>
+    <w:p>
+      <w:pPr>
+        <w:spacing w:after="240" w:before="240" w:lineRule="auto"/>
         <w:ind w:firstLine="720"/>
         <w:rPr/>
       </w:pPr>
@@ -3055,11 +4255,96 @@
         <w:rPr>
           <w:rtl w:val="0"/>
         </w:rPr>
-        <w:t xml:space="preserve">Estos resultados indican que el modelo explica una proporción muy alta de la variabilidad observada en el nivel de adicción y realiza predicciones con un error promedio inferior a dos décimas de punto en una escala de 0 a 10.</w:t>
-      </w:r>
-    </w:p>
-    <w:p>
-      <w:pPr>
+        <w:t xml:space="preserve">Al comparar estos resultados con los obtenidos por el MLP (R² = 0.987, MAE = 0.146), se observa que la red neuronal logra un ajuste considerablemente superior, reduciendo el error absoluto medio a menos de un tercio del obtenido por la Regresión Lineal. Esto sugiere que, si bien existen relaciones lineales fuertes entre algunas variables y el nivel de adicción, también hay componentes no lineales e interacciones entre variables que el MLP logra capturar y que un modelo lineal simple no puede representar.</w:t>
+      </w:r>
+    </w:p>
+    <w:p>
+      <w:pPr>
+        <w:spacing w:after="240" w:before="240" w:lineRule="auto"/>
+        <w:rPr>
+          <w:b w:val="1"/>
+          <w:bCs w:val="1"/>
+        </w:rPr>
+      </w:pPr>
+      <w:r>
+        <w:br w:type="page"/>
+      </w:r>
+      <w:r>
+        <w:rPr>
+          <w:rtl w:val="0"/>
+        </w:rPr>
+      </w:r>
+    </w:p>
+    <w:p>
+      <w:pPr>
+        <w:spacing w:after="240" w:before="240" w:lineRule="auto"/>
+        <w:rPr/>
+      </w:pPr>
+      <w:r>
+        <w:rPr>
+          <w:b w:val="1"/>
+          <w:bCs w:val="1"/>
+          <w:rtl w:val="0"/>
+        </w:rPr>
+        <w:t xml:space="preserve">Figura 7.</w:t>
+      </w:r>
+      <w:r>
+        <w:rPr>
+          <w:rtl w:val="0"/>
+        </w:rPr>
+        <w:t xml:space="preserve"> Variables más influyentes según los coeficientes de la Regresión Lineal.</w:t>
+      </w:r>
+    </w:p>
+    <w:p>
+      <w:pPr>
+        <w:spacing w:after="240" w:before="240" w:lineRule="auto"/>
+        <w:jc w:val="center"/>
+        <w:rPr/>
+      </w:pPr>
+      <w:r>
+        <w:rPr/>
+        <w:drawing>
+          <wp:inline distB="114300" distT="114300" distL="114300" distR="114300">
+            <wp:extent cx="4572000" cy="2729132"/>
+            <wp:effectExtent b="0" l="0" r="0" t="0"/>
+            <wp:docPr id="4" name="image2.png"/>
+            <a:graphic>
+              <a:graphicData uri="http://schemas.openxmlformats.org/drawingml/2006/picture">
+                <pic:pic>
+                  <pic:nvPicPr>
+                    <pic:cNvPr id="0" name="image2.png"/>
+                    <pic:cNvPicPr preferRelativeResize="0"/>
+                  </pic:nvPicPr>
+                  <pic:blipFill>
+                    <a:blip r:embed="rId13"/>
+                    <a:srcRect b="0" l="0" r="0" t="0"/>
+                    <a:stretch>
+                      <a:fillRect/>
+                    </a:stretch>
+                  </pic:blipFill>
+                  <pic:spPr>
+                    <a:xfrm>
+                      <a:off x="0" y="0"/>
+                      <a:ext cx="4572000" cy="2729132"/>
+                    </a:xfrm>
+                    <a:prstGeom prst="rect"/>
+                    <a:ln/>
+                  </pic:spPr>
+                </pic:pic>
+              </a:graphicData>
+            </a:graphic>
+          </wp:inline>
+        </w:drawing>
+      </w:r>
+      <w:r>
+        <w:rPr>
+          <w:rtl w:val="0"/>
+        </w:rPr>
+      </w:r>
+    </w:p>
+    <w:p>
+      <w:pPr>
+        <w:spacing w:after="240" w:before="240" w:lineRule="auto"/>
         <w:ind w:firstLine="720"/>
         <w:rPr/>
       </w:pPr>
@@ -3067,21 +4352,129 @@
         <w:rPr>
           <w:rtl w:val="0"/>
         </w:rPr>
-        <w:t xml:space="preserve">El elevado valor de </w:t>
-      </w:r>
-      <w:r>
-        <w:rPr>
-          <w:b w:val="1"/>
-          <w:bCs w:val="1"/>
-          <w:rtl w:val="0"/>
-        </w:rPr>
-        <w:t xml:space="preserve">R²</w:t>
-      </w:r>
-      <w:r>
-        <w:rPr>
-          <w:rtl w:val="0"/>
-        </w:rPr>
-        <w:t xml:space="preserve"> puede atribuirse, en parte, a las características del conjunto de datos utilizado. La variable objetivo (</w:t>
+        <w:t xml:space="preserve">A pesar de su menor desempeño predictivo, el modelo de Regresión Lineal aporta un valor complementario importante: la interpretabilidad directa de sus coeficientes. Las variables con mayor efecto positivo sobre el nivel de adicción fueron </w:t>
+      </w:r>
+      <w:r>
+        <w:rPr>
+          <w:b w:val="1"/>
+          <w:bCs w:val="1"/>
+          <w:rtl w:val="0"/>
+        </w:rPr>
+        <w:t xml:space="preserve">Daily_Usage_Hours</w:t>
+      </w:r>
+      <w:r>
+        <w:rPr>
+          <w:rFonts w:ascii="Gungsuh" w:cs="Gungsuh" w:eastAsia="Gungsuh" w:hAnsi="Gungsuh"/>
+          <w:rtl w:val="0"/>
+        </w:rPr>
+        <w:t xml:space="preserve"> (coeficiente ≈ 0.50), </w:t>
+      </w:r>
+      <w:r>
+        <w:rPr>
+          <w:b w:val="1"/>
+          <w:bCs w:val="1"/>
+          <w:rtl w:val="0"/>
+        </w:rPr>
+        <w:t xml:space="preserve">Time_on_Gaming</w:t>
+      </w:r>
+      <w:r>
+        <w:rPr>
+          <w:rFonts w:ascii="Gungsuh" w:cs="Gungsuh" w:eastAsia="Gungsuh" w:hAnsi="Gungsuh"/>
+          <w:rtl w:val="0"/>
+        </w:rPr>
+        <w:t xml:space="preserve"> (≈ 0.49) y </w:t>
+      </w:r>
+      <w:r>
+        <w:rPr>
+          <w:b w:val="1"/>
+          <w:bCs w:val="1"/>
+          <w:rtl w:val="0"/>
+        </w:rPr>
+        <w:t xml:space="preserve">Time_on_Social_Media</w:t>
+      </w:r>
+      <w:r>
+        <w:rPr>
+          <w:rFonts w:ascii="Gungsuh" w:cs="Gungsuh" w:eastAsia="Gungsuh" w:hAnsi="Gungsuh"/>
+          <w:rtl w:val="0"/>
+        </w:rPr>
+        <w:t xml:space="preserve"> (≈ 0.48), lo que indica que, en promedio y manteniendo las demás variables constantes, cada hora adicional dedicada a estas actividades incrementa el nivel de adicción estimado en aproximadamente medio punto en la escala de 0 a 10. En sentido contrario, </w:t>
+      </w:r>
+      <w:r>
+        <w:rPr>
+          <w:b w:val="1"/>
+          <w:bCs w:val="1"/>
+          <w:rtl w:val="0"/>
+        </w:rPr>
+        <w:t xml:space="preserve">Sleep_Hours</w:t>
+      </w:r>
+      <w:r>
+        <w:rPr>
+          <w:rFonts w:ascii="Gungsuh" w:cs="Gungsuh" w:eastAsia="Gungsuh" w:hAnsi="Gungsuh"/>
+          <w:rtl w:val="0"/>
+        </w:rPr>
+        <w:t xml:space="preserve"> presentó el efecto negativo más fuerte (coeficiente ≈ –0.25), confirmando que un mayor número de horas de sueño se asocia con una reducción del nivel de adicción.</w:t>
+      </w:r>
+    </w:p>
+    <w:p>
+      <w:pPr>
+        <w:spacing w:after="240" w:before="240" w:lineRule="auto"/>
+        <w:ind w:firstLine="720"/>
+        <w:rPr/>
+      </w:pPr>
+      <w:r>
+        <w:rPr>
+          <w:rtl w:val="0"/>
+        </w:rPr>
+        <w:t xml:space="preserve">Estos resultados coinciden con las variables identificadas como más relevantes en el análisis de correlación de Pearson (Figura 1) y en los diagramas de caja (Figura 3), lo que aporta consistencia metodológica al estudio: tanto el análisis exploratorio, como el modelo lineal interpretable y el modelo MLP de mayor desempeño, coinciden en señalar el tiempo de uso del teléfono (general, en redes sociales y en videojuegos) y las horas de sueño como los factores más determinantes del nivel de adicción. En conjunto, la comparación entre ambos modelos permite concluir que, si bien la Regresión Lineal ofrece una explicación transparente y directa de los factores asociados a la adicción, el MLP resulta más adecuado como motor de predicción del sistema por su mayor precisión, sin perder de vista que ambos enfoques son complementarios: uno para explicar y otro para predecir.</w:t>
+      </w:r>
+    </w:p>
+    <w:p>
+      <w:pPr>
+        <w:pStyle w:val="Heading2"/>
+        <w:spacing w:after="240" w:before="240" w:lineRule="auto"/>
+        <w:rPr/>
+      </w:pPr>
+      <w:bookmarkStart w:colFirst="0" w:colLast="0" w:name="_b1h62fb73dp" w:id="10"/>
+      <w:bookmarkEnd w:id="10"/>
+      <w:r>
+        <w:rPr>
+          <w:rtl w:val="0"/>
+        </w:rPr>
+        <w:t xml:space="preserve">6. Consideraciones éticas</w:t>
+      </w:r>
+    </w:p>
+    <w:p>
+      <w:pPr>
+        <w:spacing w:after="240" w:before="240" w:lineRule="auto"/>
+        <w:ind w:firstLine="720"/>
+        <w:rPr/>
+      </w:pPr>
+      <w:r>
+        <w:rPr>
+          <w:rtl w:val="0"/>
+        </w:rPr>
+        <w:t xml:space="preserve">El uso de Inteligencia Artificial para estimar el nivel de adicción al teléfono inteligente en adolescentes, una población menor de edad y en muchos casos vulnerable, exige una reflexión ética explícita, más allá del desempeño técnico del modelo.</w:t>
+      </w:r>
+    </w:p>
+    <w:p>
+      <w:pPr>
+        <w:spacing w:after="240" w:before="240" w:lineRule="auto"/>
+        <w:ind w:firstLine="720"/>
+        <w:rPr/>
+      </w:pPr>
+      <w:r>
+        <w:rPr>
+          <w:b w:val="1"/>
+          <w:bCs w:val="1"/>
+          <w:rtl w:val="0"/>
+        </w:rPr>
+        <w:t xml:space="preserve">Naturaleza de la predicción y límites del sistema.</w:t>
+      </w:r>
+      <w:r>
+        <w:rPr>
+          <w:rtl w:val="0"/>
+        </w:rPr>
+        <w:t xml:space="preserve"> Es importante precisar que el modelo desarrollado no constituye un diagnóstico clínico ni una herramienta de evaluación psicológica validada. </w:t>
       </w:r>
       <w:r>
         <w:rPr>
@@ -3095,89 +4488,179 @@
         <w:rPr>
           <w:rtl w:val="0"/>
         </w:rPr>
-        <w:t xml:space="preserve">) presenta una fuerte relación con variables como </w:t>
-      </w:r>
-      <w:r>
-        <w:rPr>
-          <w:b w:val="1"/>
-          <w:bCs w:val="1"/>
-          <w:rtl w:val="0"/>
-        </w:rPr>
-        <w:t xml:space="preserve">Daily_Usage_Hours</w:t>
-      </w:r>
-      <w:r>
-        <w:rPr>
-          <w:rtl w:val="0"/>
-        </w:rPr>
-        <w:t xml:space="preserve">, </w:t>
-      </w:r>
-      <w:r>
-        <w:rPr>
-          <w:b w:val="1"/>
-          <w:bCs w:val="1"/>
-          <w:rtl w:val="0"/>
-        </w:rPr>
-        <w:t xml:space="preserve">Time_on_Social_Media</w:t>
-      </w:r>
-      <w:r>
-        <w:rPr>
-          <w:rtl w:val="0"/>
-        </w:rPr>
-        <w:t xml:space="preserve"> y </w:t>
-      </w:r>
-      <w:r>
-        <w:rPr>
-          <w:b w:val="1"/>
-          <w:bCs w:val="1"/>
-          <w:rtl w:val="0"/>
-        </w:rPr>
-        <w:t xml:space="preserve">Apps_Used_Daily</w:t>
-      </w:r>
-      <w:r>
-        <w:rPr>
-          <w:rtl w:val="0"/>
-        </w:rPr>
-        <w:t xml:space="preserve">, las cuales mostraron las correlaciones más altas durante el análisis exploratorio. Asimismo, más del </w:t>
-      </w:r>
-      <w:r>
-        <w:rPr>
-          <w:b w:val="1"/>
-          <w:bCs w:val="1"/>
-          <w:rtl w:val="0"/>
-        </w:rPr>
-        <w:t xml:space="preserve">50 %</w:t>
-      </w:r>
-      <w:r>
-        <w:rPr>
-          <w:rtl w:val="0"/>
-        </w:rPr>
-        <w:t xml:space="preserve"> de los registros corresponde al valor máximo de la variable objetivo, reduciendo la variabilidad de una parte importante del conjunto de datos y contribuyendo al elevado desempeño observado.</w:t>
-      </w:r>
-    </w:p>
-    <w:p>
-      <w:pPr>
+        <w:t xml:space="preserve"> es una variable derivada de una encuesta autoadministrada (Kaggle, 2024), y las estimaciones del MLP reflejan patrones estadísticos aprendidos de esos datos, no un juicio clínico emitido por un profesional de la salud mental. Presentar la salida del modelo como un "diagnóstico" sería una representación engañosa de sus capacidades y podría inducir a error tanto a padres y educadores como a los propios adolescentes. Por ello, la interfaz y cualquier comunicación de resultados deben enmarcar la predicción como una </w:t>
+      </w:r>
+      <w:r>
+        <w:rPr>
+          <w:b w:val="1"/>
+          <w:bCs w:val="1"/>
+          <w:rtl w:val="0"/>
+        </w:rPr>
+        <w:t xml:space="preserve">estimación orientativa de riesgo conductual</w:t>
+      </w:r>
+      <w:r>
+        <w:rPr>
+          <w:rtl w:val="0"/>
+        </w:rPr>
+        <w:t xml:space="preserve">, y no como una conclusión médica o psicológica definitiva, dejando explícito que cualquier sospecha de adicción debe confirmarse mediante evaluación de un profesional cualificado.</w:t>
+      </w:r>
+    </w:p>
+    <w:p>
+      <w:pPr>
+        <w:spacing w:after="240" w:before="240" w:lineRule="auto"/>
         <w:ind w:firstLine="720"/>
         <w:rPr/>
       </w:pPr>
       <w:r>
         <w:rPr>
-          <w:rtl w:val="0"/>
-        </w:rPr>
-        <w:t xml:space="preserve">Por otra parte, la separación entre los conjuntos de entrenamiento y prueba, junto con la aplicación de regularización </w:t>
-      </w:r>
-      <w:r>
-        <w:rPr>
-          <w:b w:val="1"/>
-          <w:bCs w:val="1"/>
-          <w:rtl w:val="0"/>
-        </w:rPr>
-        <w:t xml:space="preserve">L2</w:t>
-      </w:r>
-      <w:r>
-        <w:rPr>
-          <w:rtl w:val="0"/>
-        </w:rPr>
-        <w:t xml:space="preserve"> (</w:t>
+          <w:b w:val="1"/>
+          <w:bCs w:val="1"/>
+          <w:rtl w:val="0"/>
+        </w:rPr>
+        <w:t xml:space="preserve">Privacidad y protección de datos de menores.</w:t>
+      </w:r>
+      <w:r>
+        <w:rPr>
+          <w:rtl w:val="0"/>
+        </w:rPr>
+        <w:t xml:space="preserve"> El conjunto de datos utilizado incluye información sensible sobre salud mental (ansiedad, depresión, autoestima) y hábitos de menores de edad. Aunque el dataset público empleado en este trabajo se encuentra anonimizado, cualquier despliegue del sistema con datos reales debería cumplir con marcos normativos de protección de datos de menores (p. ej., consentimiento parental, minimización de datos y almacenamiento seguro), y contemplar quién tiene acceso a los resultados individuales y con qué propósito.</w:t>
+      </w:r>
+    </w:p>
+    <w:p>
+      <w:pPr>
+        <w:spacing w:after="240" w:before="240" w:lineRule="auto"/>
+        <w:ind w:firstLine="720"/>
+        <w:rPr/>
+      </w:pPr>
+      <w:r>
+        <w:rPr>
+          <w:b w:val="1"/>
+          <w:bCs w:val="1"/>
+          <w:rtl w:val="0"/>
+        </w:rPr>
+        <w:t xml:space="preserve">Sesgos y representatividad del conjunto de datos.</w:t>
+      </w:r>
+      <w:r>
+        <w:rPr>
+          <w:rtl w:val="0"/>
+        </w:rPr>
+        <w:t xml:space="preserve"> El modelo fue entrenado con una única muestra de 3,000 adolescentes de un rango etario y contexto geográfico específicos, por lo que sus predicciones pueden no generalizar adecuadamente a poblaciones con características socioculturales, económicas o de acceso a tecnología distintas. Asimismo, el fuerte desbalance de clases identificado en la Figura 2 (más del 50 % de los registros en el nivel máximo de adicción) implica que el modelo tiene menos capacidad de aprendizaje sobre los casos de "No Adicto", lo que podría traducirse en una menor fiabilidad para adolescentes con perfiles de bajo riesgo si el sistema se usara en poblaciones con una distribución distinta a la del dataset de entrenamiento.</w:t>
+      </w:r>
+    </w:p>
+    <w:p>
+      <w:pPr>
+        <w:spacing w:after="240" w:before="240" w:lineRule="auto"/>
+        <w:ind w:firstLine="720"/>
+        <w:rPr/>
+      </w:pPr>
+      <w:r>
+        <w:rPr>
+          <w:b w:val="1"/>
+          <w:bCs w:val="1"/>
+          <w:rtl w:val="0"/>
+        </w:rPr>
+        <w:t xml:space="preserve">Riesgo de etiquetado y estigmatización.</w:t>
+      </w:r>
+      <w:r>
+        <w:rPr>
+          <w:rtl w:val="0"/>
+        </w:rPr>
+        <w:t xml:space="preserve"> Clasificar a un adolescente como "Adicto" (Sección 5.1) conlleva el riesgo de generar etiquetas estigmatizantes si esta información se comunica sin el debido cuidado, o si se usa para tomar decisiones (académicas, familiares o de acceso a dispositivos) sin contexto adicional. Se recomienda que cualquier resultado del sistema se presente acompañado de recomendaciones constructivas y nunca como una sentencia definitiva sobre la persona.</w:t>
+      </w:r>
+    </w:p>
+    <w:p>
+      <w:pPr>
+        <w:spacing w:after="240" w:before="240" w:lineRule="auto"/>
+        <w:ind w:firstLine="720"/>
+        <w:rPr/>
+      </w:pPr>
+      <w:r>
+        <w:rPr>
+          <w:b w:val="1"/>
+          <w:bCs w:val="1"/>
+          <w:rtl w:val="0"/>
+        </w:rPr>
+        <w:t xml:space="preserve">Supervisión humana y rol del sistema.</w:t>
+      </w:r>
+      <w:r>
+        <w:rPr>
+          <w:rtl w:val="0"/>
+        </w:rPr>
+        <w:t xml:space="preserve"> En línea con lo señalado en la Sección 4, el sistema fue concebido como una </w:t>
+      </w:r>
+      <w:r>
+        <w:rPr>
+          <w:b w:val="1"/>
+          <w:bCs w:val="1"/>
+          <w:rtl w:val="0"/>
+        </w:rPr>
+        <w:t xml:space="preserve">herramienta de apoyo</w:t>
+      </w:r>
+      <w:r>
+        <w:rPr>
+          <w:rtl w:val="0"/>
+        </w:rPr>
+        <w:t xml:space="preserve"> para padres, educadores y profesionales de la salud, no como un sustituto de su criterio. La decisión final sobre cómo actuar frente a una estimación de riesgo alto debe recaer siempre en personas capacitadas, manteniendo al ser humano en el centro del proceso de decisión ("human-in-the-loop").</w:t>
+      </w:r>
+    </w:p>
+    <w:p>
+      <w:pPr>
+        <w:spacing w:after="240" w:before="240" w:lineRule="auto"/>
+        <w:ind w:firstLine="720"/>
+        <w:rPr/>
+      </w:pPr>
+      <w:r>
+        <w:rPr>
+          <w:b w:val="1"/>
+          <w:bCs w:val="1"/>
+          <w:rtl w:val="0"/>
+        </w:rPr>
+        <w:t xml:space="preserve">Transparencia e interpretabilidad.</w:t>
+      </w:r>
+      <w:r>
+        <w:rPr>
+          <w:rtl w:val="0"/>
+        </w:rPr>
+        <w:t xml:space="preserve"> La incorporación del modelo de Regresión Lineal (Sección 5.2) no solo cumple un propósito comparativo, sino también ético: permite explicar en términos comprensibles qué factores influyen en la predicción, lo cual es especialmente relevante cuando el sistema puede afectar decisiones sobre menores. Se recomienda que futuras versiones del aplicativo incorporen explicaciones similares junto a cada predicción del MLP, en lugar de presentar únicamente un valor numérico.</w:t>
+      </w:r>
+    </w:p>
+    <w:p>
+      <w:pPr>
+        <w:spacing w:after="240" w:before="240" w:lineRule="auto"/>
+        <w:ind w:firstLine="720"/>
+        <w:rPr/>
+      </w:pPr>
+      <w:r>
+        <w:rPr>
+          <w:rtl w:val="0"/>
+        </w:rPr>
+        <w:t xml:space="preserve">En conjunto, estas consideraciones no invalidan el valor del sistema desarrollado, pero sí delimitan claramente su alcance: una herramienta de apoyo a la detección temprana, que debe usarse de manera responsable, con supervisión humana y sin sustituir la evaluación profesional.</w:t>
+      </w:r>
+    </w:p>
+    <w:p>
+      <w:pPr>
+        <w:pStyle w:val="Heading2"/>
+        <w:rPr/>
+      </w:pPr>
+      <w:bookmarkStart w:colFirst="0" w:colLast="0" w:name="_ua9jszdeip8k" w:id="11"/>
+      <w:bookmarkEnd w:id="11"/>
+      <w:r>
+        <w:rPr>
+          <w:rtl w:val="0"/>
+        </w:rPr>
+        <w:t xml:space="preserve">7. Conclusiones</w:t>
+      </w:r>
+    </w:p>
+    <w:p>
+      <w:pPr>
+        <w:ind w:firstLine="720"/>
+        <w:rPr/>
+      </w:pPr>
+      <w:r>
+        <w:rPr>
+          <w:rtl w:val="0"/>
+        </w:rPr>
+        <w:t xml:space="preserve">El presente trabajo permitió desarrollar e implementar un sistema de predicción del nivel de adicción al teléfono inteligente basado en una Red Neuronal Artificial de tipo </w:t>
       </w:r>
       <w:r>
         <w:rPr>
@@ -3185,27 +4668,13 @@
           <w:iCs w:val="1"/>
           <w:rtl w:val="0"/>
         </w:rPr>
-        <w:t xml:space="preserve">alpha</w:t>
-      </w:r>
-      <w:r>
-        <w:rPr>
-          <w:rtl w:val="0"/>
-        </w:rPr>
-        <w:t xml:space="preserve"> = 0.001), contribuye a disminuir el riesgo de sobreajuste y favorece la capacidad de generalización del modelo. El bajo valor obtenido para el </w:t>
-      </w:r>
-      <w:r>
-        <w:rPr>
-          <w:b w:val="1"/>
-          <w:bCs w:val="1"/>
-          <w:rtl w:val="0"/>
-        </w:rPr>
-        <w:t xml:space="preserve">MAE</w:t>
-      </w:r>
-      <w:r>
-        <w:rPr>
-          <w:rtl w:val="0"/>
-        </w:rPr>
-        <w:t xml:space="preserve"> respalda que las predicciones mantienen un nivel de error reducido sobre datos no utilizados durante el entrenamiento.</w:t>
+        <w:t xml:space="preserve">Multilayer Perceptron</w:t>
+      </w:r>
+      <w:r>
+        <w:rPr>
+          <w:rtl w:val="0"/>
+        </w:rPr>
+        <w:t xml:space="preserve"> (MLP), cumpliendo el objetivo general planteado. A partir de variables demográficas, conductuales y psicosociales, el modelo fue capaz de estimar el nivel de adicción de manera automatizada, constituyendo una herramienta de apoyo para la detección temprana de adolescentes con mayor riesgo de dependencia.</w:t>
       </w:r>
     </w:p>
     <w:p>
@@ -3217,7 +4686,129 @@
         <w:rPr>
           <w:rtl w:val="0"/>
         </w:rPr>
-        <w:t xml:space="preserve">Como validación cualitativa, se realizaron pruebas adicionales mediante la interfaz desarrollada en </w:t>
+        <w:t xml:space="preserve">Los resultados obtenidos evidencian un desempeño satisfactorio del modelo sobre el conjunto de datos utilizado, alcanzando un </w:t>
+      </w:r>
+      <w:r>
+        <w:rPr>
+          <w:b w:val="1"/>
+          <w:bCs w:val="1"/>
+          <w:rtl w:val="0"/>
+        </w:rPr>
+        <w:t xml:space="preserve">Coeficiente de Determinación (R²) de 0.987</w:t>
+      </w:r>
+      <w:r>
+        <w:rPr>
+          <w:rtl w:val="0"/>
+        </w:rPr>
+        <w:t xml:space="preserve"> y un </w:t>
+      </w:r>
+      <w:r>
+        <w:rPr>
+          <w:b w:val="1"/>
+          <w:bCs w:val="1"/>
+          <w:rtl w:val="0"/>
+        </w:rPr>
+        <w:t xml:space="preserve">Error Absoluto Medio (MAE) de 0.146</w:t>
+      </w:r>
+      <w:r>
+        <w:rPr>
+          <w:rtl w:val="0"/>
+        </w:rPr>
+        <w:t xml:space="preserve">. Estas métricas indican que la arquitectura propuesta logra modelar adecuadamente la relación entre los hábitos de uso del teléfono inteligente y el nivel de adicción, obteniendo estimaciones consistentes dentro de las características del conjunto de datos analizado.</w:t>
+      </w:r>
+    </w:p>
+    <w:p>
+      <w:pPr>
+        <w:ind w:firstLine="720"/>
+        <w:rPr/>
+      </w:pPr>
+      <w:r>
+        <w:rPr>
+          <w:rtl w:val="0"/>
+        </w:rPr>
+        <w:t xml:space="preserve">El análisis exploratorio permitió identificar que variables como </w:t>
+      </w:r>
+      <w:r>
+        <w:rPr>
+          <w:b w:val="1"/>
+          <w:bCs w:val="1"/>
+          <w:rtl w:val="0"/>
+        </w:rPr>
+        <w:t xml:space="preserve">Daily_Usage_Hours</w:t>
+      </w:r>
+      <w:r>
+        <w:rPr>
+          <w:rtl w:val="0"/>
+        </w:rPr>
+        <w:t xml:space="preserve">, </w:t>
+      </w:r>
+      <w:r>
+        <w:rPr>
+          <w:b w:val="1"/>
+          <w:bCs w:val="1"/>
+          <w:rtl w:val="0"/>
+        </w:rPr>
+        <w:t xml:space="preserve">Time_on_Social_Media</w:t>
+      </w:r>
+      <w:r>
+        <w:rPr>
+          <w:rtl w:val="0"/>
+        </w:rPr>
+        <w:t xml:space="preserve">, </w:t>
+      </w:r>
+      <w:r>
+        <w:rPr>
+          <w:b w:val="1"/>
+          <w:bCs w:val="1"/>
+          <w:rtl w:val="0"/>
+        </w:rPr>
+        <w:t xml:space="preserve">Apps_Used_Daily</w:t>
+      </w:r>
+      <w:r>
+        <w:rPr>
+          <w:rtl w:val="0"/>
+        </w:rPr>
+        <w:t xml:space="preserve">, </w:t>
+      </w:r>
+      <w:r>
+        <w:rPr>
+          <w:b w:val="1"/>
+          <w:bCs w:val="1"/>
+          <w:rtl w:val="0"/>
+        </w:rPr>
+        <w:t xml:space="preserve">Phone_Checks_Per_Day</w:t>
+      </w:r>
+      <w:r>
+        <w:rPr>
+          <w:rtl w:val="0"/>
+        </w:rPr>
+        <w:t xml:space="preserve"> y </w:t>
+      </w:r>
+      <w:r>
+        <w:rPr>
+          <w:b w:val="1"/>
+          <w:bCs w:val="1"/>
+          <w:rtl w:val="0"/>
+        </w:rPr>
+        <w:t xml:space="preserve">Sleep_Hours</w:t>
+      </w:r>
+      <w:r>
+        <w:rPr>
+          <w:rtl w:val="0"/>
+        </w:rPr>
+        <w:t xml:space="preserve"> constituyen los principales factores asociados al nivel de adicción. Estos resultados son consistentes con la literatura reciente, la cual señala que la intensidad de uso del teléfono inteligente representa uno de los predictores más relevantes del comportamiento adictivo en adolescentes.</w:t>
+      </w:r>
+    </w:p>
+    <w:p>
+      <w:pPr>
+        <w:ind w:firstLine="720"/>
+        <w:rPr/>
+      </w:pPr>
+      <w:r>
+        <w:rPr>
+          <w:rtl w:val="0"/>
+        </w:rPr>
+        <w:t xml:space="preserve">Desde una perspectiva aplicada, el desarrollo de una interfaz web mediante </w:t>
       </w:r>
       <w:r>
         <w:rPr>
@@ -3231,119 +4822,7 @@
         <w:rPr>
           <w:rtl w:val="0"/>
         </w:rPr>
-        <w:t xml:space="preserve">. En un primer caso, un adolescente con </w:t>
-      </w:r>
-      <w:r>
-        <w:rPr>
-          <w:b w:val="1"/>
-          <w:bCs w:val="1"/>
-          <w:rtl w:val="0"/>
-        </w:rPr>
-        <w:t xml:space="preserve">8 horas</w:t>
-      </w:r>
-      <w:r>
-        <w:rPr>
-          <w:rtl w:val="0"/>
-        </w:rPr>
-        <w:t xml:space="preserve"> de uso diario del teléfono, </w:t>
-      </w:r>
-      <w:r>
-        <w:rPr>
-          <w:b w:val="1"/>
-          <w:bCs w:val="1"/>
-          <w:rtl w:val="0"/>
-        </w:rPr>
-        <w:t xml:space="preserve">150 revisiones</w:t>
-      </w:r>
-      <w:r>
-        <w:rPr>
-          <w:rtl w:val="0"/>
-        </w:rPr>
-        <w:t xml:space="preserve"> al día y </w:t>
-      </w:r>
-      <w:r>
-        <w:rPr>
-          <w:b w:val="1"/>
-          <w:bCs w:val="1"/>
-          <w:rtl w:val="0"/>
-        </w:rPr>
-        <w:t xml:space="preserve">4 horas</w:t>
-      </w:r>
-      <w:r>
-        <w:rPr>
-          <w:rtl w:val="0"/>
-        </w:rPr>
-        <w:t xml:space="preserve"> de uso de redes sociales obtuvo una estimación de </w:t>
-      </w:r>
-      <w:r>
-        <w:rPr>
-          <w:b w:val="1"/>
-          <w:bCs w:val="1"/>
-          <w:rtl w:val="0"/>
-        </w:rPr>
-        <w:t xml:space="preserve">9.8</w:t>
-      </w:r>
-      <w:r>
-        <w:rPr>
-          <w:rtl w:val="0"/>
-        </w:rPr>
-        <w:t xml:space="preserve">, correspondiente a un nivel alto de adicción. En un segundo caso, un adolescente con </w:t>
-      </w:r>
-      <w:r>
-        <w:rPr>
-          <w:b w:val="1"/>
-          <w:bCs w:val="1"/>
-          <w:rtl w:val="0"/>
-        </w:rPr>
-        <w:t xml:space="preserve">2 horas</w:t>
-      </w:r>
-      <w:r>
-        <w:rPr>
-          <w:rtl w:val="0"/>
-        </w:rPr>
-        <w:t xml:space="preserve"> de uso diario, </w:t>
-      </w:r>
-      <w:r>
-        <w:rPr>
-          <w:b w:val="1"/>
-          <w:bCs w:val="1"/>
-          <w:rtl w:val="0"/>
-        </w:rPr>
-        <w:t xml:space="preserve">20 revisiones</w:t>
-      </w:r>
-      <w:r>
-        <w:rPr>
-          <w:rtl w:val="0"/>
-        </w:rPr>
-        <w:t xml:space="preserve"> del teléfono y </w:t>
-      </w:r>
-      <w:r>
-        <w:rPr>
-          <w:b w:val="1"/>
-          <w:bCs w:val="1"/>
-          <w:rtl w:val="0"/>
-        </w:rPr>
-        <w:t xml:space="preserve">7 horas</w:t>
-      </w:r>
-      <w:r>
-        <w:rPr>
-          <w:rtl w:val="0"/>
-        </w:rPr>
-        <w:t xml:space="preserve"> de sueño obtuvo una estimación de </w:t>
-      </w:r>
-      <w:r>
-        <w:rPr>
-          <w:b w:val="1"/>
-          <w:bCs w:val="1"/>
-          <w:rtl w:val="0"/>
-        </w:rPr>
-        <w:t xml:space="preserve">5.3</w:t>
-      </w:r>
-      <w:r>
-        <w:rPr>
-          <w:rtl w:val="0"/>
-        </w:rPr>
-        <w:t xml:space="preserve">, correspondiente a un nivel considerablemente menor de adicción. Ambos resultados son coherentes con el comportamiento esperado y muestran que el modelo responde adecuadamente a variaciones en las variables de entrada.</w:t>
+        <w:t xml:space="preserve"> demuestra que es posible integrar modelos de aprendizaje automático en herramientas accesibles para usuarios sin conocimientos técnicos, facilitando su utilización como apoyo en contextos educativos, familiares y de salud. No obstante, los resultados deben interpretarse considerando que el modelo fue entrenado con un único conjunto de datos obtenido mediante encuestas, por lo que su capacidad de generalización deberá validarse en otras poblaciones y contextos.</w:t>
       </w:r>
     </w:p>
     <w:p>
@@ -3355,155 +4834,15 @@
         <w:rPr>
           <w:rtl w:val="0"/>
         </w:rPr>
-        <w:t xml:space="preserve">Los resultados obtenidos son consistentes con investigaciones recientes sobre la predicción de la adicción al smartphone mediante técnicas de aprendizaje automático. En particular, Li et al. (2025) identifican la ansiedad y el afrontamiento emocional como factores centrales asociados a esta problemática, mientras que Liu et al. (2026) destacan la importancia de variables relacionadas con la intensidad de uso del teléfono inteligente, coincidiendo con las altas correlaciones observadas para </w:t>
-      </w:r>
-      <w:r>
-        <w:rPr>
-          <w:b w:val="1"/>
-          <w:bCs w:val="1"/>
-          <w:rtl w:val="0"/>
-        </w:rPr>
-        <w:t xml:space="preserve">Daily_Usage_Hours</w:t>
-      </w:r>
-      <w:r>
-        <w:rPr>
-          <w:rtl w:val="0"/>
-        </w:rPr>
-        <w:t xml:space="preserve"> y </w:t>
-      </w:r>
-      <w:r>
-        <w:rPr>
-          <w:b w:val="1"/>
-          <w:bCs w:val="1"/>
-          <w:rtl w:val="0"/>
-        </w:rPr>
-        <w:t xml:space="preserve">Time_on_Social_Media</w:t>
-      </w:r>
-      <w:r>
-        <w:rPr>
-          <w:rtl w:val="0"/>
-        </w:rPr>
-        <w:t xml:space="preserve"> en este estudio.</w:t>
-      </w:r>
-    </w:p>
-    <w:p>
-      <w:pPr>
-        <w:ind w:firstLine="720"/>
-        <w:rPr/>
-      </w:pPr>
-      <w:r>
-        <w:rPr>
-          <w:rtl w:val="0"/>
-        </w:rPr>
-        <w:t xml:space="preserve">Asimismo, la incorporación del nivel de ansiedad como variable predictora responde a la evidencia presentada por Zhou et al. (2025), quienes señalan que factores psicosociales como la rumiación y el acoso escolar constituyen predictores relevantes en adolescentes. De igual manera, la variable objetivo utilizada en este trabajo se fundamenta en instrumentos validados como la </w:t>
-      </w:r>
-      <w:r>
-        <w:rPr>
-          <w:b w:val="1"/>
-          <w:bCs w:val="1"/>
-          <w:rtl w:val="0"/>
-        </w:rPr>
-        <w:t xml:space="preserve">Smartphone Addiction Scale–Short Version (SAS-SV)</w:t>
-      </w:r>
-      <w:r>
-        <w:rPr>
-          <w:rtl w:val="0"/>
-        </w:rPr>
-        <w:t xml:space="preserve">, cuyas propiedades psicométricas han sido confirmadas en población hispanohablante (Hidalgo-Fuentes et al., 2025), aportando solidez a la medición del nivel de adicción. En conjunto, el elevado valor de </w:t>
-      </w:r>
-      <w:r>
-        <w:rPr>
-          <w:b w:val="1"/>
-          <w:bCs w:val="1"/>
-          <w:rtl w:val="0"/>
-        </w:rPr>
-        <w:t xml:space="preserve">R²</w:t>
-      </w:r>
-      <w:r>
-        <w:rPr>
-          <w:rtl w:val="0"/>
-        </w:rPr>
-        <w:t xml:space="preserve"> y el bajo </w:t>
-      </w:r>
-      <w:r>
-        <w:rPr>
-          <w:b w:val="1"/>
-          <w:bCs w:val="1"/>
-          <w:rtl w:val="0"/>
-        </w:rPr>
-        <w:t xml:space="preserve">MAE</w:t>
-      </w:r>
-      <w:r>
-        <w:rPr>
-          <w:rtl w:val="0"/>
-        </w:rPr>
-        <w:t xml:space="preserve"> obtenidos son coherentes con el desempeño reportado por estudios recientes que comparan múltiples modelos de aprendizaje automático para esta misma problemática (K. S. et al., 2025).</w:t>
-      </w:r>
-    </w:p>
-    <w:p>
-      <w:pPr>
-        <w:ind w:firstLine="720"/>
-        <w:rPr/>
-      </w:pPr>
-      <w:r>
-        <w:rPr>
-          <w:rtl w:val="0"/>
-        </w:rPr>
-        <w:t xml:space="preserve">Como principal limitación, el modelo depende de la calidad y consistencia de los datos proporcionados por el usuario. La presencia de valores atípicos, inconsistentes o fuera del rango observado durante el entrenamiento puede afectar la precisión de las predicciones. Además, el modelo fue entrenado utilizando un único conjunto de datos obtenido mediante encuestas, por lo que su capacidad de generalización a otras poblaciones, contextos culturales o grupos etarios deberá evaluarse mediante estudios adicionales.</w:t>
-      </w:r>
-    </w:p>
-    <w:p>
-      <w:pPr>
-        <w:ind w:firstLine="720"/>
-        <w:rPr/>
-      </w:pPr>
-      <w:r>
-        <w:rPr>
-          <w:rtl w:val="0"/>
-        </w:rPr>
-        <w:t xml:space="preserve">No obstante, el preprocesamiento de los datos mediante </w:t>
-      </w:r>
-      <w:r>
-        <w:rPr>
-          <w:b w:val="1"/>
-          <w:bCs w:val="1"/>
-          <w:rtl w:val="0"/>
-        </w:rPr>
-        <w:t xml:space="preserve">One-Hot Encoding</w:t>
-      </w:r>
-      <w:r>
-        <w:rPr>
-          <w:rtl w:val="0"/>
-        </w:rPr>
-        <w:t xml:space="preserve">, la estandarización de las variables numéricas con </w:t>
-      </w:r>
-      <w:r>
-        <w:rPr>
-          <w:b w:val="1"/>
-          <w:bCs w:val="1"/>
-          <w:rtl w:val="0"/>
-        </w:rPr>
-        <w:t xml:space="preserve">StandardScaler</w:t>
-      </w:r>
-      <w:r>
-        <w:rPr>
-          <w:rtl w:val="0"/>
-        </w:rPr>
-        <w:t xml:space="preserve"> y la incorporación de regularización </w:t>
-      </w:r>
-      <w:r>
-        <w:rPr>
-          <w:b w:val="1"/>
-          <w:bCs w:val="1"/>
-          <w:rtl w:val="0"/>
-        </w:rPr>
-        <w:t xml:space="preserve">L2</w:t>
-      </w:r>
-      <w:r>
-        <w:rPr>
-          <w:rtl w:val="0"/>
-        </w:rPr>
-        <w:t xml:space="preserve"> contribuyen a mejorar la estabilidad del modelo y su capacidad para generar predicciones consistentes frente a nuevos casos. En conjunto, los resultados obtenidos muestran que la Red Neuronal Artificial propuesta constituye una herramienta viable para estimar el nivel de adicción al teléfono inteligente dentro de las características y limitaciones del conjunto de datos utilizado.</w:t>
+        <w:t xml:space="preserve">Como líneas de trabajo futuro, se propone ampliar el conjunto de datos con información proveniente de diferentes regiones y estudios longitudinales que permitan analizar la evolución de la adicción a lo largo del tiempo. Asimismo, sería de interés comparar el desempeño del MLP con otras arquitecturas de aprendizaje profundo, como redes neuronales más profundas o modelos recurrentes (LSTM) cuando se disponga de información temporal, así como incorporar técnicas de interpretabilidad que permitan comprender con mayor detalle la contribución de cada variable en las predicciones realizadas.</w:t>
+      </w:r>
+      <w:r>
+        <w:br w:type="page"/>
+      </w:r>
+      <w:r>
+        <w:rPr>
+          <w:rtl w:val="0"/>
+        </w:rPr>
       </w:r>
     </w:p>
     <w:p>
@@ -3511,25 +4850,26 @@
         <w:pStyle w:val="Heading2"/>
         <w:rPr/>
       </w:pPr>
-      <w:bookmarkStart w:colFirst="0" w:colLast="0" w:name="_ua9jszdeip8k" w:id="8"/>
-      <w:bookmarkEnd w:id="8"/>
-      <w:r>
-        <w:rPr>
-          <w:rtl w:val="0"/>
-        </w:rPr>
-        <w:t xml:space="preserve">6. Conclusiones</w:t>
-      </w:r>
-    </w:p>
-    <w:p>
-      <w:pPr>
-        <w:ind w:firstLine="720"/>
-        <w:rPr/>
-      </w:pPr>
-      <w:r>
-        <w:rPr>
-          <w:rtl w:val="0"/>
-        </w:rPr>
-        <w:t xml:space="preserve">El presente trabajo permitió desarrollar e implementar un sistema de predicción del nivel de adicción al teléfono inteligente basado en una Red Neuronal Artificial de tipo </w:t>
+      <w:bookmarkStart w:colFirst="0" w:colLast="0" w:name="_ysit68dynlj8" w:id="12"/>
+      <w:bookmarkEnd w:id="12"/>
+      <w:r>
+        <w:rPr>
+          <w:rtl w:val="0"/>
+        </w:rPr>
+        <w:t xml:space="preserve">8. Referencias bibliográficas</w:t>
+      </w:r>
+    </w:p>
+    <w:p>
+      <w:pPr>
+        <w:spacing w:after="240" w:before="240" w:lineRule="auto"/>
+        <w:ind w:left="720" w:hanging="720"/>
+        <w:rPr/>
+      </w:pPr>
+      <w:r>
+        <w:rPr>
+          <w:rtl w:val="0"/>
+        </w:rPr>
+        <w:t xml:space="preserve">American Psychiatric Association. (2013). </w:t>
       </w:r>
       <w:r>
         <w:rPr>
@@ -3537,208 +4877,29 @@
           <w:iCs w:val="1"/>
           <w:rtl w:val="0"/>
         </w:rPr>
-        <w:t xml:space="preserve">Multilayer Perceptron</w:t>
-      </w:r>
-      <w:r>
-        <w:rPr>
-          <w:rtl w:val="0"/>
-        </w:rPr>
-        <w:t xml:space="preserve"> (MLP), cumpliendo el objetivo general planteado. A partir de variables demográficas, conductuales y psicosociales, el modelo fue capaz de estimar el nivel de adicción de manera automatizada, constituyendo una herramienta de apoyo para la detección temprana de adolescentes con mayor riesgo de dependencia.</w:t>
-      </w:r>
-    </w:p>
-    <w:p>
-      <w:pPr>
-        <w:ind w:firstLine="720"/>
-        <w:rPr/>
-      </w:pPr>
-      <w:r>
-        <w:rPr>
-          <w:rtl w:val="0"/>
-        </w:rPr>
-        <w:t xml:space="preserve">Los resultados obtenidos evidencian un desempeño satisfactorio del modelo sobre el conjunto de datos utilizado, alcanzando un </w:t>
-      </w:r>
-      <w:r>
-        <w:rPr>
-          <w:b w:val="1"/>
-          <w:bCs w:val="1"/>
-          <w:rtl w:val="0"/>
-        </w:rPr>
-        <w:t xml:space="preserve">Coeficiente de Determinación (R²) de 0.987</w:t>
-      </w:r>
-      <w:r>
-        <w:rPr>
-          <w:rtl w:val="0"/>
-        </w:rPr>
-        <w:t xml:space="preserve"> y un </w:t>
-      </w:r>
-      <w:r>
-        <w:rPr>
-          <w:b w:val="1"/>
-          <w:bCs w:val="1"/>
-          <w:rtl w:val="0"/>
-        </w:rPr>
-        <w:t xml:space="preserve">Error Absoluto Medio (MAE) de 0.146</w:t>
-      </w:r>
-      <w:r>
-        <w:rPr>
-          <w:rtl w:val="0"/>
-        </w:rPr>
-        <w:t xml:space="preserve">. Estas métricas indican que la arquitectura propuesta logra modelar adecuadamente la relación entre los hábitos de uso del teléfono inteligente y el nivel de adicción, obteniendo estimaciones consistentes dentro de las características del conjunto de datos analizado.</w:t>
-      </w:r>
-    </w:p>
-    <w:p>
-      <w:pPr>
-        <w:ind w:firstLine="720"/>
-        <w:rPr/>
-      </w:pPr>
-      <w:r>
-        <w:rPr>
-          <w:rtl w:val="0"/>
-        </w:rPr>
-        <w:t xml:space="preserve">El análisis exploratorio permitió identificar que variables como </w:t>
-      </w:r>
-      <w:r>
-        <w:rPr>
-          <w:b w:val="1"/>
-          <w:bCs w:val="1"/>
-          <w:rtl w:val="0"/>
-        </w:rPr>
-        <w:t xml:space="preserve">Daily_Usage_Hours</w:t>
-      </w:r>
-      <w:r>
-        <w:rPr>
-          <w:rtl w:val="0"/>
-        </w:rPr>
-        <w:t xml:space="preserve">, </w:t>
-      </w:r>
-      <w:r>
-        <w:rPr>
-          <w:b w:val="1"/>
-          <w:bCs w:val="1"/>
-          <w:rtl w:val="0"/>
-        </w:rPr>
-        <w:t xml:space="preserve">Time_on_Social_Media</w:t>
-      </w:r>
-      <w:r>
-        <w:rPr>
-          <w:rtl w:val="0"/>
-        </w:rPr>
-        <w:t xml:space="preserve">, </w:t>
-      </w:r>
-      <w:r>
-        <w:rPr>
-          <w:b w:val="1"/>
-          <w:bCs w:val="1"/>
-          <w:rtl w:val="0"/>
-        </w:rPr>
-        <w:t xml:space="preserve">Apps_Used_Daily</w:t>
-      </w:r>
-      <w:r>
-        <w:rPr>
-          <w:rtl w:val="0"/>
-        </w:rPr>
-        <w:t xml:space="preserve">, </w:t>
-      </w:r>
-      <w:r>
-        <w:rPr>
-          <w:b w:val="1"/>
-          <w:bCs w:val="1"/>
-          <w:rtl w:val="0"/>
-        </w:rPr>
-        <w:t xml:space="preserve">Phone_Checks_Per_Day</w:t>
-      </w:r>
-      <w:r>
-        <w:rPr>
-          <w:rtl w:val="0"/>
-        </w:rPr>
-        <w:t xml:space="preserve"> y </w:t>
-      </w:r>
-      <w:r>
-        <w:rPr>
-          <w:b w:val="1"/>
-          <w:bCs w:val="1"/>
-          <w:rtl w:val="0"/>
-        </w:rPr>
-        <w:t xml:space="preserve">Sleep_Hours</w:t>
-      </w:r>
-      <w:r>
-        <w:rPr>
-          <w:rtl w:val="0"/>
-        </w:rPr>
-        <w:t xml:space="preserve"> constituyen los principales factores asociados al nivel de adicción. Estos resultados son consistentes con la literatura reciente, la cual señala que la intensidad de uso del teléfono inteligente representa uno de los predictores más relevantes del comportamiento adictivo en adolescentes.</w:t>
-      </w:r>
-    </w:p>
-    <w:p>
-      <w:pPr>
-        <w:ind w:firstLine="720"/>
-        <w:rPr/>
-      </w:pPr>
-      <w:r>
-        <w:rPr>
-          <w:rtl w:val="0"/>
-        </w:rPr>
-        <w:t xml:space="preserve">Desde una perspectiva aplicada, el desarrollo de una interfaz web mediante </w:t>
-      </w:r>
-      <w:r>
-        <w:rPr>
-          <w:b w:val="1"/>
-          <w:bCs w:val="1"/>
-          <w:rtl w:val="0"/>
-        </w:rPr>
-        <w:t xml:space="preserve">Gradio</w:t>
-      </w:r>
-      <w:r>
-        <w:rPr>
-          <w:rtl w:val="0"/>
-        </w:rPr>
-        <w:t xml:space="preserve"> demuestra que es posible integrar modelos de aprendizaje automático en herramientas accesibles para usuarios sin conocimientos técnicos, facilitando su utilización como apoyo en contextos educativos, familiares y de salud. No obstante, los resultados deben interpretarse considerando que el modelo fue entrenado con un único conjunto de datos obtenido mediante encuestas, por lo que su capacidad de generalización deberá validarse en otras poblaciones y contextos.</w:t>
-      </w:r>
-    </w:p>
-    <w:p>
-      <w:pPr>
-        <w:ind w:firstLine="720"/>
-        <w:rPr/>
-      </w:pPr>
-      <w:r>
-        <w:rPr>
-          <w:rtl w:val="0"/>
-        </w:rPr>
-        <w:t xml:space="preserve">Como líneas de trabajo futuro, se propone ampliar el conjunto de datos con información proveniente de diferentes regiones y estudios longitudinales que permitan analizar la evolución de la adicción a lo largo del tiempo. Asimismo, sería de interés comparar el desempeño del MLP con otras arquitecturas de aprendizaje profundo, como redes neuronales más profundas o modelos recurrentes (LSTM) cuando se disponga de información temporal, así como incorporar técnicas de interpretabilidad que permitan comprender con mayor detalle la contribución de cada variable en las predicciones realizadas.</w:t>
-      </w:r>
-      <w:r>
-        <w:br w:type="page"/>
-      </w:r>
-      <w:r>
-        <w:rPr>
-          <w:rtl w:val="0"/>
-        </w:rPr>
-      </w:r>
-    </w:p>
-    <w:p>
-      <w:pPr>
-        <w:pStyle w:val="Heading2"/>
-        <w:rPr/>
-      </w:pPr>
-      <w:bookmarkStart w:colFirst="0" w:colLast="0" w:name="_ysit68dynlj8" w:id="9"/>
-      <w:bookmarkEnd w:id="9"/>
-      <w:r>
-        <w:rPr>
-          <w:rtl w:val="0"/>
-        </w:rPr>
-        <w:t xml:space="preserve">7. Referencias bibliográficas</w:t>
+        <w:t xml:space="preserve">Diagnostic and statistical manual of mental disorders</w:t>
+      </w:r>
+      <w:r>
+        <w:rPr>
+          <w:rtl w:val="0"/>
+        </w:rPr>
+        <w:t xml:space="preserve"> (5th ed.). American Psychiatric Publishing.</w:t>
       </w:r>
     </w:p>
     <w:p>
       <w:pPr>
         <w:spacing w:after="240" w:before="240" w:lineRule="auto"/>
         <w:ind w:left="720" w:hanging="720"/>
-        <w:rPr/>
-      </w:pPr>
-      <w:r>
-        <w:rPr>
-          <w:rtl w:val="0"/>
-        </w:rPr>
-        <w:t xml:space="preserve">American Psychiatric Association. (2013). </w:t>
+        <w:rPr>
+          <w:color w:val="1155cc"/>
+          <w:u w:val="single"/>
+        </w:rPr>
+      </w:pPr>
+      <w:r>
+        <w:rPr>
+          <w:rtl w:val="0"/>
+        </w:rPr>
+        <w:t xml:space="preserve">Aguirre-Peñafiel, V., &amp; Matar-Khalil, S. (2025). Mecanismos neurobiológicos del uso problemático del teléfono inteligente en adolescentes: Una revisión sistemática. </w:t>
       </w:r>
       <w:r>
         <w:rPr>
@@ -3746,36 +4907,6 @@
           <w:iCs w:val="1"/>
           <w:rtl w:val="0"/>
         </w:rPr>
-        <w:t xml:space="preserve">Diagnostic and statistical manual of mental disorders</w:t>
-      </w:r>
-      <w:r>
-        <w:rPr>
-          <w:rtl w:val="0"/>
-        </w:rPr>
-        <w:t xml:space="preserve"> (5th ed.). American Psychiatric Publishing.</w:t>
-      </w:r>
-    </w:p>
-    <w:p>
-      <w:pPr>
-        <w:spacing w:after="240" w:before="240" w:lineRule="auto"/>
-        <w:ind w:left="720" w:hanging="720"/>
-        <w:rPr>
-          <w:color w:val="1155cc"/>
-          <w:u w:val="single"/>
-        </w:rPr>
-      </w:pPr>
-      <w:r>
-        <w:rPr>
-          <w:rtl w:val="0"/>
-        </w:rPr>
-        <w:t xml:space="preserve">Aguirre-Peñafiel, V., &amp; Matar-Khalil, S. (2025). Mecanismos neurobiológicos del uso problemático del teléfono inteligente en adolescentes: Una revisión sistemática. </w:t>
-      </w:r>
-      <w:r>
-        <w:rPr>
-          <w:i w:val="1"/>
-          <w:iCs w:val="1"/>
-          <w:rtl w:val="0"/>
-        </w:rPr>
         <w:t xml:space="preserve">CES Psicología, 18</w:t>
       </w:r>
       <w:r>
@@ -3784,7 +4915,7 @@
         </w:rPr>
         <w:t xml:space="preserve">(3).</w:t>
       </w:r>
-      <w:hyperlink r:id="rId11">
+      <w:hyperlink r:id="rId14">
         <w:r>
           <w:rPr>
             <w:rtl w:val="0"/>
@@ -3792,7 +4923,7 @@
           <w:t xml:space="preserve"> </w:t>
         </w:r>
       </w:hyperlink>
-      <w:hyperlink r:id="rId12">
+      <w:hyperlink r:id="rId15">
         <w:r>
           <w:rPr>
             <w:color w:val="1155cc"/>
@@ -3837,7 +4968,7 @@
         </w:rPr>
         <w:t xml:space="preserve">.</w:t>
       </w:r>
-      <w:hyperlink r:id="rId13">
+      <w:hyperlink r:id="rId16">
         <w:r>
           <w:rPr>
             <w:rtl w:val="0"/>
@@ -3845,7 +4976,7 @@
           <w:t xml:space="preserve"> </w:t>
         </w:r>
       </w:hyperlink>
-      <w:hyperlink r:id="rId14">
+      <w:hyperlink r:id="rId17">
         <w:r>
           <w:rPr>
             <w:color w:val="1155cc"/>
@@ -3890,7 +5021,7 @@
         </w:rPr>
         <w:t xml:space="preserve">(7), e0327226.</w:t>
       </w:r>
-      <w:hyperlink r:id="rId15">
+      <w:hyperlink r:id="rId18">
         <w:r>
           <w:rPr>
             <w:rtl w:val="0"/>
@@ -3898,7 +5029,7 @@
           <w:t xml:space="preserve"> </w:t>
         </w:r>
       </w:hyperlink>
-      <w:hyperlink r:id="rId16">
+      <w:hyperlink r:id="rId19">
         <w:r>
           <w:rPr>
             <w:color w:val="1155cc"/>
@@ -3943,7 +5074,7 @@
         </w:rPr>
         <w:t xml:space="preserve">.</w:t>
       </w:r>
-      <w:hyperlink r:id="rId17">
+      <w:hyperlink r:id="rId20">
         <w:r>
           <w:rPr>
             <w:rtl w:val="0"/>
@@ -3951,7 +5082,7 @@
           <w:t xml:space="preserve"> </w:t>
         </w:r>
       </w:hyperlink>
-      <w:hyperlink r:id="rId18">
+      <w:hyperlink r:id="rId21">
         <w:r>
           <w:rPr>
             <w:color w:val="1155cc"/>
@@ -3996,7 +5127,7 @@
         </w:rPr>
         <w:t xml:space="preserve">, 105441.</w:t>
       </w:r>
-      <w:hyperlink r:id="rId19">
+      <w:hyperlink r:id="rId22">
         <w:r>
           <w:rPr>
             <w:rtl w:val="0"/>
@@ -4004,7 +5135,7 @@
           <w:t xml:space="preserve"> </w:t>
         </w:r>
       </w:hyperlink>
-      <w:hyperlink r:id="rId20">
+      <w:hyperlink r:id="rId23">
         <w:r>
           <w:rPr>
             <w:color w:val="1155cc"/>
@@ -4049,7 +5180,7 @@
         </w:rPr>
         <w:t xml:space="preserve"> (pp. 1–9). IEEE.</w:t>
       </w:r>
-      <w:hyperlink r:id="rId21">
+      <w:hyperlink r:id="rId24">
         <w:r>
           <w:rPr>
             <w:rtl w:val="0"/>
@@ -4057,7 +5188,7 @@
           <w:t xml:space="preserve"> </w:t>
         </w:r>
       </w:hyperlink>
-      <w:hyperlink r:id="rId22">
+      <w:hyperlink r:id="rId25">
         <w:r>
           <w:rPr>
             <w:color w:val="1155cc"/>
@@ -4102,7 +5233,7 @@
         </w:rPr>
         <w:t xml:space="preserve">, 120096.</w:t>
       </w:r>
-      <w:hyperlink r:id="rId23">
+      <w:hyperlink r:id="rId26">
         <w:r>
           <w:rPr>
             <w:rtl w:val="0"/>
@@ -4110,7 +5241,7 @@
           <w:t xml:space="preserve"> </w:t>
         </w:r>
       </w:hyperlink>
-      <w:hyperlink r:id="rId24">
+      <w:hyperlink r:id="rId27">
         <w:r>
           <w:rPr>
             <w:color w:val="1155cc"/>
@@ -4155,7 +5286,7 @@
         </w:rPr>
         <w:t xml:space="preserve">, 122007.</w:t>
       </w:r>
-      <w:hyperlink r:id="rId25">
+      <w:hyperlink r:id="rId28">
         <w:r>
           <w:rPr>
             <w:rtl w:val="0"/>
@@ -4163,7 +5294,7 @@
           <w:t xml:space="preserve"> </w:t>
         </w:r>
       </w:hyperlink>
-      <w:hyperlink r:id="rId26">
+      <w:hyperlink r:id="rId29">
         <w:r>
           <w:rPr>
             <w:color w:val="1155cc"/>
@@ -4235,7 +5366,7 @@
         </w:rPr>
         <w:t xml:space="preserve">.</w:t>
       </w:r>
-      <w:hyperlink r:id="rId27">
+      <w:hyperlink r:id="rId30">
         <w:r>
           <w:rPr>
             <w:rtl w:val="0"/>
@@ -4243,7 +5374,7 @@
           <w:t xml:space="preserve"> </w:t>
         </w:r>
       </w:hyperlink>
-      <w:hyperlink r:id="rId28">
+      <w:hyperlink r:id="rId31">
         <w:r>
           <w:rPr>
             <w:color w:val="1155cc"/>
@@ -4285,7 +5416,7 @@
         </w:rPr>
         <w:t xml:space="preserve">, 104749.</w:t>
       </w:r>
-      <w:hyperlink r:id="rId29">
+      <w:hyperlink r:id="rId32">
         <w:r>
           <w:rPr>
             <w:rtl w:val="0"/>
@@ -4293,7 +5424,7 @@
           <w:t xml:space="preserve"> </w:t>
         </w:r>
       </w:hyperlink>
-      <w:hyperlink r:id="rId30">
+      <w:hyperlink r:id="rId33">
         <w:r>
           <w:rPr>
             <w:color w:val="1155cc"/>
@@ -4327,13 +5458,13 @@
         <w:pStyle w:val="Heading2"/>
         <w:rPr/>
       </w:pPr>
-      <w:bookmarkStart w:colFirst="0" w:colLast="0" w:name="_1se86cuk6hoh" w:id="10"/>
-      <w:bookmarkEnd w:id="10"/>
-      <w:r>
-        <w:rPr>
-          <w:rtl w:val="0"/>
-        </w:rPr>
-        <w:t xml:space="preserve">8. Anexos</w:t>
+      <w:bookmarkStart w:colFirst="0" w:colLast="0" w:name="_1se86cuk6hoh" w:id="13"/>
+      <w:bookmarkEnd w:id="13"/>
+      <w:r>
+        <w:rPr>
+          <w:rtl w:val="0"/>
+        </w:rPr>
+        <w:t xml:space="preserve">9. Anexos</w:t>
       </w:r>
     </w:p>
     <w:p>
@@ -4341,8 +5472,8 @@
         <w:pStyle w:val="Heading3"/>
         <w:rPr/>
       </w:pPr>
-      <w:bookmarkStart w:colFirst="0" w:colLast="0" w:name="_yt7bk9gjemi9" w:id="11"/>
-      <w:bookmarkEnd w:id="11"/>
+      <w:bookmarkStart w:colFirst="0" w:colLast="0" w:name="_yt7bk9gjemi9" w:id="14"/>
+      <w:bookmarkEnd w:id="14"/>
       <w:r>
         <w:rPr>
           <w:rtl w:val="0"/>
@@ -4368,7 +5499,7 @@
         </w:rPr>
         <w:t xml:space="preserve"> </w:t>
       </w:r>
-      <w:hyperlink r:id="rId31">
+      <w:hyperlink r:id="rId34">
         <w:r>
           <w:rPr>
             <w:color w:val="1155cc"/>
@@ -4385,7 +5516,7 @@
       </w:r>
     </w:p>
     <w:sectPr>
-      <w:headerReference r:id="rId32" w:type="default"/>
+      <w:headerReference r:id="rId35" w:type="default"/>
       <w:pgSz w:h="15840" w:w="12240" w:orient="portrait"/>
       <w:pgMar w:bottom="1440" w:top="1440" w:left="1440" w:right="1440" w:header="720" w:footer="720"/>
       <w:pgNumType w:start="1"/>
@@ -4415,7 +5546,7 @@
     <w:lvl w:ilvl="0">
       <w:start w:val="1"/>
       <w:numFmt w:val="bullet"/>
-      <w:lvlText w:val="❖"/>
+      <w:lvlText w:val="●"/>
       <w:lvlJc w:val="left"/>
       <w:pPr>
         <w:ind w:left="720" w:hanging="360"/>
@@ -4427,7 +5558,7 @@
     <w:lvl w:ilvl="1">
       <w:start w:val="1"/>
       <w:numFmt w:val="bullet"/>
-      <w:lvlText w:val="➢"/>
+      <w:lvlText w:val="○"/>
       <w:lvlJc w:val="left"/>
       <w:pPr>
         <w:ind w:left="1440" w:hanging="360"/>
@@ -4463,7 +5594,7 @@
     <w:lvl w:ilvl="4">
       <w:start w:val="1"/>
       <w:numFmt w:val="bullet"/>
-      <w:lvlText w:val="◆"/>
+      <w:lvlText w:val="○"/>
       <w:lvlJc w:val="left"/>
       <w:pPr>
         <w:ind w:left="3600" w:hanging="360"/>
@@ -4475,7 +5606,7 @@
     <w:lvl w:ilvl="5">
       <w:start w:val="1"/>
       <w:numFmt w:val="bullet"/>
-      <w:lvlText w:val="➢"/>
+      <w:lvlText w:val="■"/>
       <w:lvlJc w:val="left"/>
       <w:pPr>
         <w:ind w:left="4320" w:hanging="360"/>
@@ -4487,7 +5618,7 @@
     <w:lvl w:ilvl="6">
       <w:start w:val="1"/>
       <w:numFmt w:val="bullet"/>
-      <w:lvlText w:val="■"/>
+      <w:lvlText w:val="●"/>
       <w:lvlJc w:val="left"/>
       <w:pPr>
         <w:ind w:left="5040" w:hanging="360"/>
@@ -4499,7 +5630,7 @@
     <w:lvl w:ilvl="7">
       <w:start w:val="1"/>
       <w:numFmt w:val="bullet"/>
-      <w:lvlText w:val="●"/>
+      <w:lvlText w:val="○"/>
       <w:lvlJc w:val="left"/>
       <w:pPr>
         <w:ind w:left="5760" w:hanging="360"/>
@@ -4511,7 +5642,7 @@
     <w:lvl w:ilvl="8">
       <w:start w:val="1"/>
       <w:numFmt w:val="bullet"/>
-      <w:lvlText w:val="◆"/>
+      <w:lvlText w:val="■"/>
       <w:lvlJc w:val="left"/>
       <w:pPr>
         <w:ind w:left="6480" w:hanging="360"/>
@@ -4732,6 +5863,226 @@
       <w:start w:val="1"/>
       <w:numFmt w:val="bullet"/>
       <w:lvlText w:val="◆"/>
+      <w:lvlJc w:val="left"/>
+      <w:pPr>
+        <w:ind w:left="6480" w:hanging="360"/>
+      </w:pPr>
+      <w:rPr>
+        <w:u w:val="none"/>
+      </w:rPr>
+    </w:lvl>
+  </w:abstractNum>
+  <w:abstractNum w:abstractNumId="4">
+    <w:lvl w:ilvl="0">
+      <w:start w:val="1"/>
+      <w:numFmt w:val="bullet"/>
+      <w:lvlText w:val="❖"/>
+      <w:lvlJc w:val="left"/>
+      <w:pPr>
+        <w:ind w:left="720" w:hanging="360"/>
+      </w:pPr>
+      <w:rPr>
+        <w:u w:val="none"/>
+      </w:rPr>
+    </w:lvl>
+    <w:lvl w:ilvl="1">
+      <w:start w:val="1"/>
+      <w:numFmt w:val="bullet"/>
+      <w:lvlText w:val="➢"/>
+      <w:lvlJc w:val="left"/>
+      <w:pPr>
+        <w:ind w:left="1440" w:hanging="360"/>
+      </w:pPr>
+      <w:rPr>
+        <w:u w:val="none"/>
+      </w:rPr>
+    </w:lvl>
+    <w:lvl w:ilvl="2">
+      <w:start w:val="1"/>
+      <w:numFmt w:val="bullet"/>
+      <w:lvlText w:val="■"/>
+      <w:lvlJc w:val="left"/>
+      <w:pPr>
+        <w:ind w:left="2160" w:hanging="360"/>
+      </w:pPr>
+      <w:rPr>
+        <w:u w:val="none"/>
+      </w:rPr>
+    </w:lvl>
+    <w:lvl w:ilvl="3">
+      <w:start w:val="1"/>
+      <w:numFmt w:val="bullet"/>
+      <w:lvlText w:val="●"/>
+      <w:lvlJc w:val="left"/>
+      <w:pPr>
+        <w:ind w:left="2880" w:hanging="360"/>
+      </w:pPr>
+      <w:rPr>
+        <w:u w:val="none"/>
+      </w:rPr>
+    </w:lvl>
+    <w:lvl w:ilvl="4">
+      <w:start w:val="1"/>
+      <w:numFmt w:val="bullet"/>
+      <w:lvlText w:val="◆"/>
+      <w:lvlJc w:val="left"/>
+      <w:pPr>
+        <w:ind w:left="3600" w:hanging="360"/>
+      </w:pPr>
+      <w:rPr>
+        <w:u w:val="none"/>
+      </w:rPr>
+    </w:lvl>
+    <w:lvl w:ilvl="5">
+      <w:start w:val="1"/>
+      <w:numFmt w:val="bullet"/>
+      <w:lvlText w:val="➢"/>
+      <w:lvlJc w:val="left"/>
+      <w:pPr>
+        <w:ind w:left="4320" w:hanging="360"/>
+      </w:pPr>
+      <w:rPr>
+        <w:u w:val="none"/>
+      </w:rPr>
+    </w:lvl>
+    <w:lvl w:ilvl="6">
+      <w:start w:val="1"/>
+      <w:numFmt w:val="bullet"/>
+      <w:lvlText w:val="■"/>
+      <w:lvlJc w:val="left"/>
+      <w:pPr>
+        <w:ind w:left="5040" w:hanging="360"/>
+      </w:pPr>
+      <w:rPr>
+        <w:u w:val="none"/>
+      </w:rPr>
+    </w:lvl>
+    <w:lvl w:ilvl="7">
+      <w:start w:val="1"/>
+      <w:numFmt w:val="bullet"/>
+      <w:lvlText w:val="●"/>
+      <w:lvlJc w:val="left"/>
+      <w:pPr>
+        <w:ind w:left="5760" w:hanging="360"/>
+      </w:pPr>
+      <w:rPr>
+        <w:u w:val="none"/>
+      </w:rPr>
+    </w:lvl>
+    <w:lvl w:ilvl="8">
+      <w:start w:val="1"/>
+      <w:numFmt w:val="bullet"/>
+      <w:lvlText w:val="◆"/>
+      <w:lvlJc w:val="left"/>
+      <w:pPr>
+        <w:ind w:left="6480" w:hanging="360"/>
+      </w:pPr>
+      <w:rPr>
+        <w:u w:val="none"/>
+      </w:rPr>
+    </w:lvl>
+  </w:abstractNum>
+  <w:abstractNum w:abstractNumId="5">
+    <w:lvl w:ilvl="0">
+      <w:start w:val="1"/>
+      <w:numFmt w:val="bullet"/>
+      <w:lvlText w:val="●"/>
+      <w:lvlJc w:val="left"/>
+      <w:pPr>
+        <w:ind w:left="720" w:hanging="360"/>
+      </w:pPr>
+      <w:rPr>
+        <w:u w:val="none"/>
+      </w:rPr>
+    </w:lvl>
+    <w:lvl w:ilvl="1">
+      <w:start w:val="1"/>
+      <w:numFmt w:val="bullet"/>
+      <w:lvlText w:val="○"/>
+      <w:lvlJc w:val="left"/>
+      <w:pPr>
+        <w:ind w:left="1440" w:hanging="360"/>
+      </w:pPr>
+      <w:rPr>
+        <w:u w:val="none"/>
+      </w:rPr>
+    </w:lvl>
+    <w:lvl w:ilvl="2">
+      <w:start w:val="1"/>
+      <w:numFmt w:val="bullet"/>
+      <w:lvlText w:val="■"/>
+      <w:lvlJc w:val="left"/>
+      <w:pPr>
+        <w:ind w:left="2160" w:hanging="360"/>
+      </w:pPr>
+      <w:rPr>
+        <w:u w:val="none"/>
+      </w:rPr>
+    </w:lvl>
+    <w:lvl w:ilvl="3">
+      <w:start w:val="1"/>
+      <w:numFmt w:val="bullet"/>
+      <w:lvlText w:val="●"/>
+      <w:lvlJc w:val="left"/>
+      <w:pPr>
+        <w:ind w:left="2880" w:hanging="360"/>
+      </w:pPr>
+      <w:rPr>
+        <w:u w:val="none"/>
+      </w:rPr>
+    </w:lvl>
+    <w:lvl w:ilvl="4">
+      <w:start w:val="1"/>
+      <w:numFmt w:val="bullet"/>
+      <w:lvlText w:val="○"/>
+      <w:lvlJc w:val="left"/>
+      <w:pPr>
+        <w:ind w:left="3600" w:hanging="360"/>
+      </w:pPr>
+      <w:rPr>
+        <w:u w:val="none"/>
+      </w:rPr>
+    </w:lvl>
+    <w:lvl w:ilvl="5">
+      <w:start w:val="1"/>
+      <w:numFmt w:val="bullet"/>
+      <w:lvlText w:val="■"/>
+      <w:lvlJc w:val="left"/>
+      <w:pPr>
+        <w:ind w:left="4320" w:hanging="360"/>
+      </w:pPr>
+      <w:rPr>
+        <w:u w:val="none"/>
+      </w:rPr>
+    </w:lvl>
+    <w:lvl w:ilvl="6">
+      <w:start w:val="1"/>
+      <w:numFmt w:val="bullet"/>
+      <w:lvlText w:val="●"/>
+      <w:lvlJc w:val="left"/>
+      <w:pPr>
+        <w:ind w:left="5040" w:hanging="360"/>
+      </w:pPr>
+      <w:rPr>
+        <w:u w:val="none"/>
+      </w:rPr>
+    </w:lvl>
+    <w:lvl w:ilvl="7">
+      <w:start w:val="1"/>
+      <w:numFmt w:val="bullet"/>
+      <w:lvlText w:val="○"/>
+      <w:lvlJc w:val="left"/>
+      <w:pPr>
+        <w:ind w:left="5760" w:hanging="360"/>
+      </w:pPr>
+      <w:rPr>
+        <w:u w:val="none"/>
+      </w:rPr>
+    </w:lvl>
+    <w:lvl w:ilvl="8">
+      <w:start w:val="1"/>
+      <w:numFmt w:val="bullet"/>
+      <w:lvlText w:val="■"/>
       <w:lvlJc w:val="left"/>
       <w:pPr>
         <w:ind w:left="6480" w:hanging="360"/>
@@ -4749,6 +6100,12 @@
   </w:num>
   <w:num w:numId="3">
     <w:abstractNumId w:val="3"/>
+  </w:num>
+  <w:num w:numId="4">
+    <w:abstractNumId w:val="4"/>
+  </w:num>
+  <w:num w:numId="5">
+    <w:abstractNumId w:val="5"/>
   </w:num>
 </w:numbering>
 </file>

</xml_diff>